<commit_message>
Deploying to gh-pages from @ Morrison-Lab/wai@be6ac269d1f1df540cd82bd81e63c75f2b95f555 🚀
</commit_message>
<xml_diff>
--- a/chapters/agent-orchestration.docx
+++ b/chapters/agent-orchestration.docx
@@ -15,7 +15,7 @@
         <w:pStyle w:val="Date"/>
       </w:pPr>
       <w:r>
-        <w:t xml:space="preserve">Last modified: 2026-09-10 16:15:18 (PDT)</w:t>
+        <w:t xml:space="preserve">Last modified: 2026-09-10 16:29:57 (PDT)</w:t>
       </w:r>
     </w:p>
     <w:p>
@@ -63,7 +63,7 @@
         <w:t xml:space="preserve"> </w:t>
       </w:r>
       <w:r>
-        <w:t xml:space="preserve">and evaluates three outside</w:t>
+        <w:t xml:space="preserve">evaluates three outside</w:t>
       </w:r>
       <w:r>
         <w:t xml:space="preserve"> </w:t>
@@ -81,7 +81,19 @@
         <w:t xml:space="preserve"> </w:t>
       </w:r>
       <w:r>
-        <w:t xml:space="preserve">that lab members have asked about.</w:t>
+        <w:t xml:space="preserve">that lab members have asked about,</w:t>
+      </w:r>
+      <w:r>
+        <w:t xml:space="preserve"> </w:t>
+      </w:r>
+      <w:r>
+        <w:t xml:space="preserve">and surveys the general-purpose orchestration frameworks</w:t>
+      </w:r>
+      <w:r>
+        <w:t xml:space="preserve"> </w:t>
+      </w:r>
+      <w:r>
+        <w:t xml:space="preserve">a lab could build its own agent systems on.</w:t>
       </w:r>
     </w:p>
     <w:tbl>
@@ -1895,13 +1907,2620 @@
       </w:tr>
     </w:tbl>
     <w:bookmarkEnd w:id="34"/>
-    <w:bookmarkStart w:id="35" w:name="sec-orch-comparison"/>
+    <w:bookmarkStart w:id="65" w:name="sec-orch-frameworks"/>
     <w:p>
       <w:pPr>
         <w:pStyle w:val="Heading1"/>
       </w:pPr>
       <w:r>
-        <w:t xml:space="preserve">6. Comparison</w:t>
+        <w:t xml:space="preserve">6. Agent Orchestration Frameworks</w:t>
+      </w:r>
+    </w:p>
+    <w:p>
+      <w:pPr>
+        <w:pStyle w:val="FirstParagraph"/>
+      </w:pPr>
+      <w:r>
+        <w:t xml:space="preserve">The three projects above are finished tools.</w:t>
+      </w:r>
+      <w:r>
+        <w:t xml:space="preserve"> </w:t>
+      </w:r>
+      <w:r>
+        <w:t xml:space="preserve">The projects in this section are</w:t>
+      </w:r>
+      <w:r>
+        <w:t xml:space="preserve"> </w:t>
+      </w:r>
+      <w:r>
+        <w:rPr>
+          <w:i/>
+          <w:iCs/>
+        </w:rPr>
+        <w:t xml:space="preserve">frameworks</w:t>
+      </w:r>
+      <w:r>
+        <w:t xml:space="preserve">:</w:t>
+      </w:r>
+      <w:r>
+        <w:t xml:space="preserve"> </w:t>
+      </w:r>
+      <w:r>
+        <w:t xml:space="preserve">software libraries for building your own multi-agent system</w:t>
+      </w:r>
+      <w:r>
+        <w:t xml:space="preserve"> </w:t>
+      </w:r>
+      <w:r>
+        <w:t xml:space="preserve">from agents, tools, and a control flow that you write in code.</w:t>
+      </w:r>
+      <w:r>
+        <w:t xml:space="preserve"> </w:t>
+      </w:r>
+      <w:r>
+        <w:t xml:space="preserve">They matter to us for a different reason.</w:t>
+      </w:r>
+      <w:r>
+        <w:t xml:space="preserve"> </w:t>
+      </w:r>
+      <w:r>
+        <w:t xml:space="preserve">Nobody in the lab is asking to run</w:t>
+      </w:r>
+      <w:r>
+        <w:t xml:space="preserve"> </w:t>
+      </w:r>
+      <w:r>
+        <w:rPr>
+          <w:rStyle w:val="VerbatimChar"/>
+        </w:rPr>
+        <w:t xml:space="preserve">AutoGen</w:t>
+      </w:r>
+      <w:r>
+        <w:t xml:space="preserve">;</w:t>
+      </w:r>
+      <w:r>
+        <w:t xml:space="preserve"> </w:t>
+      </w:r>
+      <w:r>
+        <w:t xml:space="preserve">the question is whether any of these libraries</w:t>
+      </w:r>
+      <w:r>
+        <w:t xml:space="preserve"> </w:t>
+      </w:r>
+      <w:r>
+        <w:t xml:space="preserve">would let us build something our Claude Code stack cannot.</w:t>
+      </w:r>
+    </w:p>
+    <w:p>
+      <w:pPr>
+        <w:pStyle w:val="BodyText"/>
+      </w:pPr>
+      <w:r>
+        <w:t xml:space="preserve">Every framework below shares one property worth stating up front.</w:t>
+      </w:r>
+      <w:r>
+        <w:t xml:space="preserve"> </w:t>
+      </w:r>
+      <w:r>
+        <w:t xml:space="preserve">Each is a Python (or TypeScript, or .NET) library</w:t>
+      </w:r>
+      <w:r>
+        <w:t xml:space="preserve"> </w:t>
+      </w:r>
+      <w:r>
+        <w:t xml:space="preserve">for writing an</w:t>
+      </w:r>
+      <w:r>
+        <w:t xml:space="preserve"> </w:t>
+      </w:r>
+      <w:r>
+        <w:rPr>
+          <w:i/>
+          <w:iCs/>
+        </w:rPr>
+        <w:t xml:space="preserve">application</w:t>
+      </w:r>
+      <w:r>
+        <w:t xml:space="preserve"> </w:t>
+      </w:r>
+      <w:r>
+        <w:t xml:space="preserve">that calls model APIs directly.</w:t>
+      </w:r>
+      <w:r>
+        <w:t xml:space="preserve"> </w:t>
+      </w:r>
+      <w:r>
+        <w:t xml:space="preserve">Our workflow instead orchestrates a coding agent from the outside,</w:t>
+      </w:r>
+      <w:r>
+        <w:t xml:space="preserve"> </w:t>
+      </w:r>
+      <w:r>
+        <w:t xml:space="preserve">through Claude Code’s subagents,</w:t>
+      </w:r>
+      <w:r>
+        <w:t xml:space="preserve"> </w:t>
+      </w:r>
+      <w:r>
+        <w:rPr>
+          <w:rStyle w:val="VerbatimChar"/>
+        </w:rPr>
+        <w:t xml:space="preserve">Workflow</w:t>
+      </w:r>
+      <w:r>
+        <w:t xml:space="preserve"> </w:t>
+      </w:r>
+      <w:r>
+        <w:t xml:space="preserve">fan-out, hooks, and Git worktrees,</w:t>
+      </w:r>
+      <w:r>
+        <w:t xml:space="preserve"> </w:t>
+      </w:r>
+      <w:r>
+        <w:t xml:space="preserve">and our research code is in R and Quarto.</w:t>
+      </w:r>
+      <w:r>
+        <w:t xml:space="preserve"> </w:t>
+      </w:r>
+      <w:r>
+        <w:t xml:space="preserve">None of these frameworks has an R interface,</w:t>
+      </w:r>
+      <w:r>
+        <w:t xml:space="preserve"> </w:t>
+      </w:r>
+      <w:r>
+        <w:t xml:space="preserve">so adopting one would add a Python application layer</w:t>
+      </w:r>
+      <w:r>
+        <w:t xml:space="preserve"> </w:t>
+      </w:r>
+      <w:r>
+        <w:t xml:space="preserve">between us and the models,</w:t>
+      </w:r>
+      <w:r>
+        <w:t xml:space="preserve"> </w:t>
+      </w:r>
+      <w:r>
+        <w:t xml:space="preserve">and that layer would need its own maintenance.</w:t>
+      </w:r>
+      <w:r>
+        <w:t xml:space="preserve"> </w:t>
+      </w:r>
+      <w:r>
+        <w:t xml:space="preserve">That cost is the yardstick for every verdict here.</w:t>
+      </w:r>
+    </w:p>
+    <w:p>
+      <w:pPr>
+        <w:pStyle w:val="BodyText"/>
+      </w:pPr>
+      <w:r>
+        <w:t xml:space="preserve">Star counts, release versions, and dates in this section</w:t>
+      </w:r>
+      <w:r>
+        <w:t xml:space="preserve"> </w:t>
+      </w:r>
+      <w:r>
+        <w:t xml:space="preserve">were read from the GitHub API on 2026-09-09</w:t>
+      </w:r>
+      <w:r>
+        <w:t xml:space="preserve"> </w:t>
+      </w:r>
+      <w:r>
+        <w:t xml:space="preserve">and will drift.</w:t>
+      </w:r>
+    </w:p>
+    <w:bookmarkStart w:id="38" w:name="sec-orch-autogen"/>
+    <w:p>
+      <w:pPr>
+        <w:pStyle w:val="Heading2"/>
+      </w:pPr>
+      <w:r>
+        <w:t xml:space="preserve">6.1 Microsoft AutoGen</w:t>
+      </w:r>
+    </w:p>
+    <w:p>
+      <w:pPr>
+        <w:pStyle w:val="FirstParagraph"/>
+      </w:pPr>
+      <w:hyperlink r:id="rId35">
+        <w:r>
+          <w:rPr>
+            <w:rStyle w:val="Hyperlink"/>
+          </w:rPr>
+          <w:t xml:space="preserve">AutoGen</w:t>
+        </w:r>
+      </w:hyperlink>
+      <w:r>
+        <w:t xml:space="preserve"> </w:t>
+      </w:r>
+      <w:r>
+        <w:t xml:space="preserve">(Microsoft 2026b)</w:t>
+      </w:r>
+      <w:r>
+        <w:t xml:space="preserve"> </w:t>
+      </w:r>
+      <w:r>
+        <w:t xml:space="preserve">is Microsoft’s original multi-agent framework,</w:t>
+      </w:r>
+      <w:r>
+        <w:t xml:space="preserve"> </w:t>
+      </w:r>
+      <w:r>
+        <w:t xml:space="preserve">and the one issue #101 named first.</w:t>
+      </w:r>
+      <w:r>
+        <w:t xml:space="preserve"> </w:t>
+      </w:r>
+      <w:r>
+        <w:t xml:space="preserve">Its current design is layered:</w:t>
+      </w:r>
+    </w:p>
+    <w:p>
+      <w:pPr>
+        <w:pStyle w:val="Compact"/>
+        <w:numPr>
+          <w:ilvl w:val="0"/>
+          <w:numId w:val="1003"/>
+        </w:numPr>
+      </w:pPr>
+      <w:r>
+        <w:rPr>
+          <w:rStyle w:val="VerbatimChar"/>
+        </w:rPr>
+        <w:t xml:space="preserve">Core</w:t>
+      </w:r>
+      <w:r>
+        <w:t xml:space="preserve">: an event-driven, actor-style runtime for message-passing agents.</w:t>
+      </w:r>
+    </w:p>
+    <w:p>
+      <w:pPr>
+        <w:pStyle w:val="Compact"/>
+        <w:numPr>
+          <w:ilvl w:val="0"/>
+          <w:numId w:val="1003"/>
+        </w:numPr>
+      </w:pPr>
+      <w:r>
+        <w:rPr>
+          <w:rStyle w:val="VerbatimChar"/>
+        </w:rPr>
+        <w:t xml:space="preserve">AgentChat</w:t>
+      </w:r>
+      <w:r>
+        <w:t xml:space="preserve">: the high-level API most users see,</w:t>
+      </w:r>
+      <w:r>
+        <w:t xml:space="preserve"> </w:t>
+      </w:r>
+      <w:r>
+        <w:t xml:space="preserve">where agents are grouped into</w:t>
+      </w:r>
+      <w:r>
+        <w:t xml:space="preserve"> </w:t>
+      </w:r>
+      <w:r>
+        <w:rPr>
+          <w:i/>
+          <w:iCs/>
+        </w:rPr>
+        <w:t xml:space="preserve">teams</w:t>
+      </w:r>
+      <w:r>
+        <w:t xml:space="preserve"> </w:t>
+      </w:r>
+      <w:r>
+        <w:t xml:space="preserve">(round-robin group chats, model-selected speakers, swarm-style handoff)</w:t>
+      </w:r>
+      <w:r>
+        <w:t xml:space="preserve"> </w:t>
+      </w:r>
+      <w:r>
+        <w:t xml:space="preserve">that pass a task around until a termination condition fires</w:t>
+      </w:r>
+      <w:r>
+        <w:t xml:space="preserve"> </w:t>
+      </w:r>
+      <w:r>
+        <w:t xml:space="preserve">(Microsoft 2026a)</w:t>
+      </w:r>
+      <w:r>
+        <w:t xml:space="preserve">.</w:t>
+      </w:r>
+    </w:p>
+    <w:p>
+      <w:pPr>
+        <w:pStyle w:val="Compact"/>
+        <w:numPr>
+          <w:ilvl w:val="0"/>
+          <w:numId w:val="1003"/>
+        </w:numPr>
+      </w:pPr>
+      <w:r>
+        <w:rPr>
+          <w:rStyle w:val="VerbatimChar"/>
+        </w:rPr>
+        <w:t xml:space="preserve">Extensions</w:t>
+      </w:r>
+      <w:r>
+        <w:t xml:space="preserve">: model clients and tools for outside services.</w:t>
+      </w:r>
+    </w:p>
+    <w:p>
+      <w:pPr>
+        <w:pStyle w:val="Compact"/>
+        <w:numPr>
+          <w:ilvl w:val="0"/>
+          <w:numId w:val="1003"/>
+        </w:numPr>
+      </w:pPr>
+      <w:r>
+        <w:rPr>
+          <w:rStyle w:val="VerbatimChar"/>
+        </w:rPr>
+        <w:t xml:space="preserve">Studio</w:t>
+      </w:r>
+      <w:r>
+        <w:t xml:space="preserve">: a no-code web interface built on</w:t>
+      </w:r>
+      <w:r>
+        <w:t xml:space="preserve"> </w:t>
+      </w:r>
+      <w:r>
+        <w:rPr>
+          <w:rStyle w:val="VerbatimChar"/>
+        </w:rPr>
+        <w:t xml:space="preserve">AgentChat</w:t>
+      </w:r>
+      <w:r>
+        <w:t xml:space="preserve">.</w:t>
+      </w:r>
+    </w:p>
+    <w:p>
+      <w:pPr>
+        <w:pStyle w:val="FirstParagraph"/>
+      </w:pPr>
+      <w:r>
+        <w:t xml:space="preserve">It is Python-first (Python 3.10 or later), with a .NET port.</w:t>
+      </w:r>
+      <w:r>
+        <w:t xml:space="preserve"> </w:t>
+      </w:r>
+      <w:r>
+        <w:t xml:space="preserve">The code is under the</w:t>
+      </w:r>
+      <w:r>
+        <w:t xml:space="preserve"> </w:t>
+      </w:r>
+      <w:r>
+        <w:rPr>
+          <w:b/>
+          <w:bCs/>
+        </w:rPr>
+        <w:t xml:space="preserve">MIT</w:t>
+      </w:r>
+      <w:r>
+        <w:t xml:space="preserve"> </w:t>
+      </w:r>
+      <w:r>
+        <w:t xml:space="preserve">license</w:t>
+      </w:r>
+      <w:r>
+        <w:t xml:space="preserve"> </w:t>
+      </w:r>
+      <w:r>
+        <w:t xml:space="preserve">and the documentation under CC-BY-4.0</w:t>
+      </w:r>
+      <w:r>
+        <w:t xml:space="preserve"> </w:t>
+      </w:r>
+      <w:r>
+        <w:t xml:space="preserve">(Microsoft 2026c)</w:t>
+      </w:r>
+      <w:r>
+        <w:t xml:space="preserve">.</w:t>
+      </w:r>
+    </w:p>
+    <w:p>
+      <w:pPr>
+        <w:pStyle w:val="BodyText"/>
+      </w:pPr>
+      <w:r>
+        <w:t xml:space="preserve">The decisive fact is on its own README (measured 2026-09-09):</w:t>
+      </w:r>
+      <w:r>
+        <w:t xml:space="preserve"> </w:t>
+      </w:r>
+      <w:r>
+        <w:t xml:space="preserve">AutoGen is in</w:t>
+      </w:r>
+      <w:r>
+        <w:t xml:space="preserve"> </w:t>
+      </w:r>
+      <w:r>
+        <w:rPr>
+          <w:b/>
+          <w:bCs/>
+        </w:rPr>
+        <w:t xml:space="preserve">maintenance mode</w:t>
+      </w:r>
+      <w:r>
+        <w:t xml:space="preserve">.</w:t>
+      </w:r>
+      <w:r>
+        <w:t xml:space="preserve"> </w:t>
+      </w:r>
+      <w:r>
+        <w:t xml:space="preserve">It</w:t>
+      </w:r>
+      <w:r>
+        <w:t xml:space="preserve"> </w:t>
+      </w:r>
+      <w:r>
+        <w:t xml:space="preserve">“will not receive new features or enhancements and is community managed going forward,”</w:t>
+      </w:r>
+      <w:r>
+        <w:t xml:space="preserve"> </w:t>
+      </w:r>
+      <w:r>
+        <w:t xml:space="preserve">and new users are directed to the Microsoft Agent Framework below.</w:t>
+      </w:r>
+      <w:r>
+        <w:t xml:space="preserve"> </w:t>
+      </w:r>
+      <w:r>
+        <w:t xml:space="preserve">The last release was</w:t>
+      </w:r>
+      <w:r>
+        <w:t xml:space="preserve"> </w:t>
+      </w:r>
+      <w:r>
+        <w:rPr>
+          <w:rStyle w:val="VerbatimChar"/>
+        </w:rPr>
+        <w:t xml:space="preserve">python-v0.7.5</w:t>
+      </w:r>
+      <w:r>
+        <w:t xml:space="preserve"> </w:t>
+      </w:r>
+      <w:r>
+        <w:t xml:space="preserve">on 2025-09-30,</w:t>
+      </w:r>
+      <w:r>
+        <w:t xml:space="preserve"> </w:t>
+      </w:r>
+      <w:r>
+        <w:t xml:space="preserve">and the repository’s last push was in April 2026,</w:t>
+      </w:r>
+      <w:r>
+        <w:t xml:space="preserve"> </w:t>
+      </w:r>
+      <w:r>
+        <w:t xml:space="preserve">even though it still carries about 60,900 stars</w:t>
+      </w:r>
+      <w:r>
+        <w:t xml:space="preserve"> </w:t>
+      </w:r>
+      <w:r>
+        <w:t xml:space="preserve">(Microsoft 2026c)</w:t>
+      </w:r>
+      <w:r>
+        <w:t xml:space="preserve">.</w:t>
+      </w:r>
+    </w:p>
+    <w:tbl>
+      <w:tblPr>
+        <w:tblStyle w:val="Table"/>
+        <w:tblLook w:firstRow="0" w:lastRow="0" w:firstColumn="0" w:lastColumn="0" w:noHBand="0" w:noVBand="0" w:val="0000"/>
+        <w:tblBorders>
+          <w:top w:val="single" w:sz="4" w:space="0" w:color="0758E5"/>
+          <w:left w:val="single" w:sz="24" w:space="0" w:color="0758E5"/>
+          <w:bottom w:val="single" w:sz="4" w:space="0" w:color="0758E5"/>
+          <w:right w:val="single" w:sz="4" w:space="0" w:color="0758E5"/>
+        </w:tblBorders>
+        <w:tblCellMar>
+          <w:left w:w="144" w:type="dxa"/>
+          <w:right w:w="144" w:type="dxa"/>
+        </w:tblCellMar>
+        <w:tblLook w:firstRow="0" w:lastRow="0" w:firstColumn="0" w:lastColumn="0" w:noHBand="0" w:noVBand="0" w:val="0000"/>
+      </w:tblPr>
+      <w:tr>
+        <w:trPr>
+          <w:cantSplit/>
+        </w:trPr>
+        <w:tc>
+          <w:tcPr>
+            <w:shd w:color="auto" w:fill="dae6fb" w:val="clear"/>
+            <w:tcMar>
+              <w:top w:w="92" w:type="dxa"/>
+              <w:bottom w:w="92" w:type="dxa"/>
+            </w:tcMar>
+          </w:tcPr>
+          <w:p>
+            <w:pPr>
+              <w:pStyle w:val="BodyText"/>
+            </w:pPr>
+            <w:pPr>
+              <w:spacing w:before="0" w:after="0"/>
+              <w:textAlignment w:val="center"/>
+            </w:pPr>
+            <w:r>
+              <w:drawing>
+                <wp:inline>
+                  <wp:extent cx="152400" cy="152400"/>
+                  <wp:effectExtent b="0" l="0" r="0" t="0"/>
+                  <wp:docPr descr="" title="" id="36" name="Picture"/>
+                  <a:graphic>
+                    <a:graphicData uri="http://schemas.openxmlformats.org/drawingml/2006/picture">
+                      <pic:pic>
+                        <pic:nvPicPr>
+                          <pic:cNvPr descr="/opt/quarto/share/formats/docx/note.png" id="37" name="Picture"/>
+                          <pic:cNvPicPr>
+                            <a:picLocks noChangeArrowheads="1" noChangeAspect="1"/>
+                          </pic:cNvPicPr>
+                        </pic:nvPicPr>
+                        <pic:blipFill>
+                          <a:blip r:embed="rId31"/>
+                          <a:stretch>
+                            <a:fillRect/>
+                          </a:stretch>
+                        </pic:blipFill>
+                        <pic:spPr bwMode="auto">
+                          <a:xfrm>
+                            <a:off x="0" y="0"/>
+                            <a:ext cx="152400" cy="152400"/>
+                          </a:xfrm>
+                          <a:prstGeom prst="rect">
+                            <a:avLst/>
+                          </a:prstGeom>
+                          <a:noFill/>
+                          <a:ln w="9525">
+                            <a:noFill/>
+                            <a:headEnd/>
+                            <a:tailEnd/>
+                          </a:ln>
+                        </pic:spPr>
+                      </pic:pic>
+                    </a:graphicData>
+                  </a:graphic>
+                </wp:inline>
+              </w:drawing>
+            </w:r>
+            <w:r>
+              <w:t xml:space="preserve"> </w:t>
+            </w:r>
+            <w:r>
+              <w:t xml:space="preserve"> </w:t>
+            </w:r>
+            <w:r>
+              <w:t xml:space="preserve">Useful to us? No</w:t>
+            </w:r>
+          </w:p>
+        </w:tc>
+      </w:tr>
+      <w:tr>
+        <w:trPr>
+          <w:cantSplit/>
+        </w:trPr>
+        <w:tc>
+          <w:tcPr>
+            <w:tcMar>
+              <w:top w:w="108" w:type="dxa"/>
+              <w:bottom w:w="108" w:type="dxa"/>
+            </w:tcMar>
+          </w:tcPr>
+          <w:p>
+            <w:pPr>
+              <w:pStyle w:val="BodyText"/>
+            </w:pPr>
+            <w:pPr>
+              <w:spacing w:before="16" w:after="16"/>
+            </w:pPr>
+            <w:r>
+              <w:t xml:space="preserve">AutoGen is the best-known name on this list</w:t>
+            </w:r>
+            <w:r>
+              <w:t xml:space="preserve"> </w:t>
+            </w:r>
+            <w:r>
+              <w:t xml:space="preserve">and is no longer where its own authors want new work to go.</w:t>
+            </w:r>
+            <w:r>
+              <w:t xml:space="preserve"> </w:t>
+            </w:r>
+            <w:r>
+              <w:t xml:space="preserve">Its group-chat orchestration</w:t>
+            </w:r>
+            <w:r>
+              <w:t xml:space="preserve"> </w:t>
+            </w:r>
+            <w:r>
+              <w:t xml:space="preserve">is what our subagents and</w:t>
+            </w:r>
+            <w:r>
+              <w:t xml:space="preserve"> </w:t>
+            </w:r>
+            <w:r>
+              <w:rPr>
+                <w:rStyle w:val="VerbatimChar"/>
+              </w:rPr>
+              <w:t xml:space="preserve">Workflow</w:t>
+            </w:r>
+            <w:r>
+              <w:t xml:space="preserve"> </w:t>
+            </w:r>
+            <w:r>
+              <w:t xml:space="preserve">fan-out already give us,</w:t>
+            </w:r>
+            <w:r>
+              <w:t xml:space="preserve"> </w:t>
+            </w:r>
+            <w:r>
+              <w:t xml:space="preserve">without a Python application to maintain.</w:t>
+            </w:r>
+            <w:r>
+              <w:t xml:space="preserve"> </w:t>
+            </w:r>
+            <w:r>
+              <w:t xml:space="preserve">If any Microsoft framework is worth watching, it is the successor.</w:t>
+            </w:r>
+          </w:p>
+          <w:p/>
+        </w:tc>
+      </w:tr>
+    </w:tbl>
+    <w:bookmarkEnd w:id="38"/>
+    <w:bookmarkStart w:id="42" w:name="sec-orch-maf"/>
+    <w:p>
+      <w:pPr>
+        <w:pStyle w:val="Heading2"/>
+      </w:pPr>
+      <w:r>
+        <w:t xml:space="preserve">6.2 Microsoft Agent Framework</w:t>
+      </w:r>
+    </w:p>
+    <w:p>
+      <w:pPr>
+        <w:pStyle w:val="FirstParagraph"/>
+      </w:pPr>
+      <w:r>
+        <w:t xml:space="preserve">The</w:t>
+      </w:r>
+      <w:r>
+        <w:t xml:space="preserve"> </w:t>
+      </w:r>
+      <w:hyperlink r:id="rId39">
+        <w:r>
+          <w:rPr>
+            <w:rStyle w:val="Hyperlink"/>
+          </w:rPr>
+          <w:t xml:space="preserve">Microsoft Agent Framework</w:t>
+        </w:r>
+      </w:hyperlink>
+      <w:r>
+        <w:t xml:space="preserve"> </w:t>
+      </w:r>
+      <w:r>
+        <w:t xml:space="preserve">(Microsoft 2026d)</w:t>
+      </w:r>
+      <w:r>
+        <w:t xml:space="preserve"> </w:t>
+      </w:r>
+      <w:r>
+        <w:t xml:space="preserve">merges AutoGen with Semantic Kernel, Microsoft’s earlier .NET-first library,</w:t>
+      </w:r>
+      <w:r>
+        <w:t xml:space="preserve"> </w:t>
+      </w:r>
+      <w:r>
+        <w:t xml:space="preserve">into one production-oriented framework for Python and .NET,</w:t>
+      </w:r>
+      <w:r>
+        <w:t xml:space="preserve"> </w:t>
+      </w:r>
+      <w:r>
+        <w:t xml:space="preserve">with a separate Go SDK.</w:t>
+      </w:r>
+      <w:r>
+        <w:t xml:space="preserve"> </w:t>
+      </w:r>
+      <w:r>
+        <w:t xml:space="preserve">Orchestration is expressed as</w:t>
+      </w:r>
+      <w:r>
+        <w:t xml:space="preserve"> </w:t>
+      </w:r>
+      <w:r>
+        <w:rPr>
+          <w:b/>
+          <w:bCs/>
+        </w:rPr>
+        <w:t xml:space="preserve">graph-based workflows</w:t>
+      </w:r>
+      <w:r>
+        <w:t xml:space="preserve"> </w:t>
+      </w:r>
+      <w:r>
+        <w:t xml:space="preserve">with built-in sequential, concurrent, handoff, and group-collaboration patterns,</w:t>
+      </w:r>
+      <w:r>
+        <w:t xml:space="preserve"> </w:t>
+      </w:r>
+      <w:r>
+        <w:t xml:space="preserve">plus checkpoints, streaming, human-in-the-loop steps, and</w:t>
+      </w:r>
+      <w:r>
+        <w:t xml:space="preserve"> </w:t>
+      </w:r>
+      <w:r>
+        <w:rPr>
+          <w:rStyle w:val="VerbatimChar"/>
+        </w:rPr>
+        <w:t xml:space="preserve">OpenTelemetry</w:t>
+      </w:r>
+      <w:r>
+        <w:t xml:space="preserve"> </w:t>
+      </w:r>
+      <w:r>
+        <w:t xml:space="preserve">tracing.</w:t>
+      </w:r>
+      <w:r>
+        <w:t xml:space="preserve"> </w:t>
+      </w:r>
+      <w:r>
+        <w:t xml:space="preserve">Agents can also be declared in YAML.</w:t>
+      </w:r>
+      <w:r>
+        <w:t xml:space="preserve"> </w:t>
+      </w:r>
+      <w:r>
+        <w:t xml:space="preserve">It is under the</w:t>
+      </w:r>
+      <w:r>
+        <w:t xml:space="preserve"> </w:t>
+      </w:r>
+      <w:r>
+        <w:rPr>
+          <w:b/>
+          <w:bCs/>
+        </w:rPr>
+        <w:t xml:space="preserve">MIT</w:t>
+      </w:r>
+      <w:r>
+        <w:t xml:space="preserve"> </w:t>
+      </w:r>
+      <w:r>
+        <w:t xml:space="preserve">license,</w:t>
+      </w:r>
+      <w:r>
+        <w:t xml:space="preserve"> </w:t>
+      </w:r>
+      <w:r>
+        <w:t xml:space="preserve">has about 13,400 stars,</w:t>
+      </w:r>
+      <w:r>
+        <w:t xml:space="preserve"> </w:t>
+      </w:r>
+      <w:r>
+        <w:t xml:space="preserve">and released</w:t>
+      </w:r>
+      <w:r>
+        <w:t xml:space="preserve"> </w:t>
+      </w:r>
+      <w:r>
+        <w:rPr>
+          <w:rStyle w:val="VerbatimChar"/>
+        </w:rPr>
+        <w:t xml:space="preserve">python-1.17.0</w:t>
+      </w:r>
+      <w:r>
+        <w:t xml:space="preserve"> </w:t>
+      </w:r>
+      <w:r>
+        <w:t xml:space="preserve">on 2026-09-03 (measured 2026-09-09).</w:t>
+      </w:r>
+    </w:p>
+    <w:tbl>
+      <w:tblPr>
+        <w:tblStyle w:val="Table"/>
+        <w:tblLook w:firstRow="0" w:lastRow="0" w:firstColumn="0" w:lastColumn="0" w:noHBand="0" w:noVBand="0" w:val="0000"/>
+        <w:tblBorders>
+          <w:top w:val="single" w:sz="4" w:space="0" w:color="0758E5"/>
+          <w:left w:val="single" w:sz="24" w:space="0" w:color="0758E5"/>
+          <w:bottom w:val="single" w:sz="4" w:space="0" w:color="0758E5"/>
+          <w:right w:val="single" w:sz="4" w:space="0" w:color="0758E5"/>
+        </w:tblBorders>
+        <w:tblCellMar>
+          <w:left w:w="144" w:type="dxa"/>
+          <w:right w:w="144" w:type="dxa"/>
+        </w:tblCellMar>
+        <w:tblLook w:firstRow="0" w:lastRow="0" w:firstColumn="0" w:lastColumn="0" w:noHBand="0" w:noVBand="0" w:val="0000"/>
+      </w:tblPr>
+      <w:tr>
+        <w:trPr>
+          <w:cantSplit/>
+        </w:trPr>
+        <w:tc>
+          <w:tcPr>
+            <w:shd w:color="auto" w:fill="dae6fb" w:val="clear"/>
+            <w:tcMar>
+              <w:top w:w="92" w:type="dxa"/>
+              <w:bottom w:w="92" w:type="dxa"/>
+            </w:tcMar>
+          </w:tcPr>
+          <w:p>
+            <w:pPr>
+              <w:pStyle w:val="BodyText"/>
+            </w:pPr>
+            <w:pPr>
+              <w:spacing w:before="0" w:after="0"/>
+              <w:textAlignment w:val="center"/>
+            </w:pPr>
+            <w:r>
+              <w:drawing>
+                <wp:inline>
+                  <wp:extent cx="152400" cy="152400"/>
+                  <wp:effectExtent b="0" l="0" r="0" t="0"/>
+                  <wp:docPr descr="" title="" id="40" name="Picture"/>
+                  <a:graphic>
+                    <a:graphicData uri="http://schemas.openxmlformats.org/drawingml/2006/picture">
+                      <pic:pic>
+                        <pic:nvPicPr>
+                          <pic:cNvPr descr="/opt/quarto/share/formats/docx/note.png" id="41" name="Picture"/>
+                          <pic:cNvPicPr>
+                            <a:picLocks noChangeArrowheads="1" noChangeAspect="1"/>
+                          </pic:cNvPicPr>
+                        </pic:nvPicPr>
+                        <pic:blipFill>
+                          <a:blip r:embed="rId31"/>
+                          <a:stretch>
+                            <a:fillRect/>
+                          </a:stretch>
+                        </pic:blipFill>
+                        <pic:spPr bwMode="auto">
+                          <a:xfrm>
+                            <a:off x="0" y="0"/>
+                            <a:ext cx="152400" cy="152400"/>
+                          </a:xfrm>
+                          <a:prstGeom prst="rect">
+                            <a:avLst/>
+                          </a:prstGeom>
+                          <a:noFill/>
+                          <a:ln w="9525">
+                            <a:noFill/>
+                            <a:headEnd/>
+                            <a:tailEnd/>
+                          </a:ln>
+                        </pic:spPr>
+                      </pic:pic>
+                    </a:graphicData>
+                  </a:graphic>
+                </wp:inline>
+              </w:drawing>
+            </w:r>
+            <w:r>
+              <w:t xml:space="preserve"> </w:t>
+            </w:r>
+            <w:r>
+              <w:t xml:space="preserve"> </w:t>
+            </w:r>
+            <w:r>
+              <w:t xml:space="preserve">Useful to us? Not now</w:t>
+            </w:r>
+          </w:p>
+        </w:tc>
+      </w:tr>
+      <w:tr>
+        <w:trPr>
+          <w:cantSplit/>
+        </w:trPr>
+        <w:tc>
+          <w:tcPr>
+            <w:tcMar>
+              <w:top w:w="108" w:type="dxa"/>
+              <w:bottom w:w="108" w:type="dxa"/>
+            </w:tcMar>
+          </w:tcPr>
+          <w:p>
+            <w:pPr>
+              <w:pStyle w:val="BodyText"/>
+            </w:pPr>
+            <w:pPr>
+              <w:spacing w:before="16" w:after="16"/>
+            </w:pPr>
+            <w:r>
+              <w:t xml:space="preserve">It is the framework to name if someone asks</w:t>
+            </w:r>
+            <w:r>
+              <w:t xml:space="preserve"> </w:t>
+            </w:r>
+            <w:r>
+              <w:t xml:space="preserve">“what replaced AutoGen?”</w:t>
+            </w:r>
+            <w:r>
+              <w:t xml:space="preserve">,</w:t>
+            </w:r>
+            <w:r>
+              <w:t xml:space="preserve"> </w:t>
+            </w:r>
+            <w:r>
+              <w:t xml:space="preserve">and its workflow patterns are a clean catalog of the orchestration shapes</w:t>
+            </w:r>
+            <w:r>
+              <w:t xml:space="preserve"> </w:t>
+            </w:r>
+            <w:r>
+              <w:t xml:space="preserve">that also appear in our</w:t>
+            </w:r>
+            <w:r>
+              <w:t xml:space="preserve"> </w:t>
+            </w:r>
+            <w:r>
+              <w:rPr>
+                <w:rStyle w:val="VerbatimChar"/>
+              </w:rPr>
+              <w:t xml:space="preserve">Workflow</w:t>
+            </w:r>
+            <w:r>
+              <w:t xml:space="preserve"> </w:t>
+            </w:r>
+            <w:r>
+              <w:t xml:space="preserve">tool.</w:t>
+            </w:r>
+            <w:r>
+              <w:t xml:space="preserve"> </w:t>
+            </w:r>
+            <w:r>
+              <w:t xml:space="preserve">But its hosting story centers on Microsoft Foundry and Azure,</w:t>
+            </w:r>
+            <w:r>
+              <w:t xml:space="preserve"> </w:t>
+            </w:r>
+            <w:r>
+              <w:t xml:space="preserve">which we do not use,</w:t>
+            </w:r>
+            <w:r>
+              <w:t xml:space="preserve"> </w:t>
+            </w:r>
+            <w:r>
+              <w:t xml:space="preserve">and the general Python-layer cost applies.</w:t>
+            </w:r>
+          </w:p>
+          <w:p/>
+        </w:tc>
+      </w:tr>
+    </w:tbl>
+    <w:bookmarkEnd w:id="42"/>
+    <w:bookmarkStart w:id="46" w:name="sec-orch-langgraph"/>
+    <w:p>
+      <w:pPr>
+        <w:pStyle w:val="Heading2"/>
+      </w:pPr>
+      <w:r>
+        <w:t xml:space="preserve">6.3 LangGraph</w:t>
+      </w:r>
+    </w:p>
+    <w:p>
+      <w:pPr>
+        <w:pStyle w:val="FirstParagraph"/>
+      </w:pPr>
+      <w:hyperlink r:id="rId43">
+        <w:r>
+          <w:rPr>
+            <w:rStyle w:val="Hyperlink"/>
+          </w:rPr>
+          <w:t xml:space="preserve">LangGraph</w:t>
+        </w:r>
+      </w:hyperlink>
+      <w:r>
+        <w:t xml:space="preserve"> </w:t>
+      </w:r>
+      <w:r>
+        <w:t xml:space="preserve">(LangChain 2026b)</w:t>
+      </w:r>
+      <w:r>
+        <w:t xml:space="preserve"> </w:t>
+      </w:r>
+      <w:r>
+        <w:t xml:space="preserve">is LangChain Inc.’s</w:t>
+      </w:r>
+      <w:r>
+        <w:t xml:space="preserve"> </w:t>
+      </w:r>
+      <w:r>
+        <w:t xml:space="preserve">“low-level orchestration framework and runtime</w:t>
+      </w:r>
+      <w:r>
+        <w:t xml:space="preserve"> </w:t>
+      </w:r>
+      <w:r>
+        <w:t xml:space="preserve">for building, managing, and deploying long-running, stateful agents.”</w:t>
+      </w:r>
+      <w:r>
+        <w:t xml:space="preserve"> </w:t>
+      </w:r>
+      <w:r>
+        <w:t xml:space="preserve">Orchestration is a</w:t>
+      </w:r>
+      <w:r>
+        <w:t xml:space="preserve"> </w:t>
+      </w:r>
+      <w:r>
+        <w:rPr>
+          <w:b/>
+          <w:bCs/>
+        </w:rPr>
+        <w:t xml:space="preserve">graph</w:t>
+      </w:r>
+      <w:r>
+        <w:t xml:space="preserve">:</w:t>
+      </w:r>
+      <w:r>
+        <w:t xml:space="preserve"> </w:t>
+      </w:r>
+      <w:r>
+        <w:t xml:space="preserve">you write nodes (a model call, a tool, or plain deterministic code),</w:t>
+      </w:r>
+      <w:r>
+        <w:t xml:space="preserve"> </w:t>
+      </w:r>
+      <w:r>
+        <w:t xml:space="preserve">connect them with edges, including conditional ones,</w:t>
+      </w:r>
+      <w:r>
+        <w:t xml:space="preserve"> </w:t>
+      </w:r>
+      <w:r>
+        <w:t xml:space="preserve">and share a typed state object between them.</w:t>
+      </w:r>
+      <w:r>
+        <w:t xml:space="preserve"> </w:t>
+      </w:r>
+      <w:r>
+        <w:t xml:space="preserve">The runtime adds checkpoints, so a run can be paused, resumed, or replayed,</w:t>
+      </w:r>
+      <w:r>
+        <w:t xml:space="preserve"> </w:t>
+      </w:r>
+      <w:r>
+        <w:t xml:space="preserve">interrupts for human-in-the-loop approval,</w:t>
+      </w:r>
+      <w:r>
+        <w:t xml:space="preserve"> </w:t>
+      </w:r>
+      <w:r>
+        <w:t xml:space="preserve">and durable execution for long tasks.</w:t>
+      </w:r>
+      <w:r>
+        <w:t xml:space="preserve"> </w:t>
+      </w:r>
+      <w:r>
+        <w:t xml:space="preserve">It is available in Python and JavaScript,</w:t>
+      </w:r>
+      <w:r>
+        <w:t xml:space="preserve"> </w:t>
+      </w:r>
+      <w:r>
+        <w:t xml:space="preserve">can be used without the wider LangChain library,</w:t>
+      </w:r>
+      <w:r>
+        <w:t xml:space="preserve"> </w:t>
+      </w:r>
+      <w:r>
+        <w:t xml:space="preserve">and integrates with LangSmith for tracing and hosted deployment</w:t>
+      </w:r>
+      <w:r>
+        <w:t xml:space="preserve"> </w:t>
+      </w:r>
+      <w:r>
+        <w:t xml:space="preserve">(LangChain 2026a)</w:t>
+      </w:r>
+      <w:r>
+        <w:t xml:space="preserve">.</w:t>
+      </w:r>
+      <w:r>
+        <w:t xml:space="preserve"> </w:t>
+      </w:r>
+      <w:r>
+        <w:t xml:space="preserve">The code is under the</w:t>
+      </w:r>
+      <w:r>
+        <w:t xml:space="preserve"> </w:t>
+      </w:r>
+      <w:r>
+        <w:rPr>
+          <w:b/>
+          <w:bCs/>
+        </w:rPr>
+        <w:t xml:space="preserve">MIT</w:t>
+      </w:r>
+      <w:r>
+        <w:t xml:space="preserve"> </w:t>
+      </w:r>
+      <w:r>
+        <w:t xml:space="preserve">license,</w:t>
+      </w:r>
+      <w:r>
+        <w:t xml:space="preserve"> </w:t>
+      </w:r>
+      <w:r>
+        <w:t xml:space="preserve">has about 41,300 stars,</w:t>
+      </w:r>
+      <w:r>
+        <w:t xml:space="preserve"> </w:t>
+      </w:r>
+      <w:r>
+        <w:t xml:space="preserve">and releases are tagged per package</w:t>
+      </w:r>
+      <w:r>
+        <w:t xml:space="preserve"> </w:t>
+      </w:r>
+      <w:r>
+        <w:t xml:space="preserve">(the most recent,</w:t>
+      </w:r>
+      <w:r>
+        <w:t xml:space="preserve"> </w:t>
+      </w:r>
+      <w:r>
+        <w:rPr>
+          <w:rStyle w:val="VerbatimChar"/>
+        </w:rPr>
+        <w:t xml:space="preserve">sdk==0.4.4</w:t>
+      </w:r>
+      <w:r>
+        <w:t xml:space="preserve">, on 2026-08-27; measured 2026-09-09).</w:t>
+      </w:r>
+    </w:p>
+    <w:tbl>
+      <w:tblPr>
+        <w:tblStyle w:val="Table"/>
+        <w:tblLook w:firstRow="0" w:lastRow="0" w:firstColumn="0" w:lastColumn="0" w:noHBand="0" w:noVBand="0" w:val="0000"/>
+        <w:tblBorders>
+          <w:top w:val="single" w:sz="4" w:space="0" w:color="00A047"/>
+          <w:left w:val="single" w:sz="24" w:space="0" w:color="00A047"/>
+          <w:bottom w:val="single" w:sz="4" w:space="0" w:color="00A047"/>
+          <w:right w:val="single" w:sz="4" w:space="0" w:color="00A047"/>
+        </w:tblBorders>
+        <w:tblCellMar>
+          <w:left w:w="144" w:type="dxa"/>
+          <w:right w:w="144" w:type="dxa"/>
+        </w:tblCellMar>
+        <w:tblLook w:firstRow="0" w:lastRow="0" w:firstColumn="0" w:lastColumn="0" w:noHBand="0" w:noVBand="0" w:val="0000"/>
+      </w:tblPr>
+      <w:tr>
+        <w:trPr>
+          <w:cantSplit/>
+        </w:trPr>
+        <w:tc>
+          <w:tcPr>
+            <w:shd w:color="auto" w:fill="ccf1e3" w:val="clear"/>
+            <w:tcMar>
+              <w:top w:w="92" w:type="dxa"/>
+              <w:bottom w:w="92" w:type="dxa"/>
+            </w:tcMar>
+          </w:tcPr>
+          <w:p>
+            <w:pPr>
+              <w:pStyle w:val="BodyText"/>
+            </w:pPr>
+            <w:pPr>
+              <w:spacing w:before="0" w:after="0"/>
+              <w:textAlignment w:val="center"/>
+            </w:pPr>
+            <w:r>
+              <w:drawing>
+                <wp:inline>
+                  <wp:extent cx="152400" cy="152400"/>
+                  <wp:effectExtent b="0" l="0" r="0" t="0"/>
+                  <wp:docPr descr="" title="" id="44" name="Picture"/>
+                  <a:graphic>
+                    <a:graphicData uri="http://schemas.openxmlformats.org/drawingml/2006/picture">
+                      <pic:pic>
+                        <pic:nvPicPr>
+                          <pic:cNvPr descr="/opt/quarto/share/formats/docx/tip.png" id="45" name="Picture"/>
+                          <pic:cNvPicPr>
+                            <a:picLocks noChangeArrowheads="1" noChangeAspect="1"/>
+                          </pic:cNvPicPr>
+                        </pic:nvPicPr>
+                        <pic:blipFill>
+                          <a:blip r:embed="rId18"/>
+                          <a:stretch>
+                            <a:fillRect/>
+                          </a:stretch>
+                        </pic:blipFill>
+                        <pic:spPr bwMode="auto">
+                          <a:xfrm>
+                            <a:off x="0" y="0"/>
+                            <a:ext cx="152400" cy="152400"/>
+                          </a:xfrm>
+                          <a:prstGeom prst="rect">
+                            <a:avLst/>
+                          </a:prstGeom>
+                          <a:noFill/>
+                          <a:ln w="9525">
+                            <a:noFill/>
+                            <a:headEnd/>
+                            <a:tailEnd/>
+                          </a:ln>
+                        </pic:spPr>
+                      </pic:pic>
+                    </a:graphicData>
+                  </a:graphic>
+                </wp:inline>
+              </w:drawing>
+            </w:r>
+            <w:r>
+              <w:t xml:space="preserve"> </w:t>
+            </w:r>
+            <w:r>
+              <w:t xml:space="preserve"> </w:t>
+            </w:r>
+            <w:r>
+              <w:t xml:space="preserve">Useful to us? Worth knowing, not adopting</w:t>
+            </w:r>
+          </w:p>
+        </w:tc>
+      </w:tr>
+      <w:tr>
+        <w:trPr>
+          <w:cantSplit/>
+        </w:trPr>
+        <w:tc>
+          <w:tcPr>
+            <w:tcMar>
+              <w:top w:w="108" w:type="dxa"/>
+              <w:bottom w:w="108" w:type="dxa"/>
+            </w:tcMar>
+          </w:tcPr>
+          <w:p>
+            <w:pPr>
+              <w:pStyle w:val="BodyText"/>
+            </w:pPr>
+            <w:pPr>
+              <w:spacing w:before="16" w:after="16"/>
+            </w:pPr>
+            <w:r>
+              <w:t xml:space="preserve">LangGraph is the most general and least opinionated framework here,</w:t>
+            </w:r>
+            <w:r>
+              <w:t xml:space="preserve"> </w:t>
+            </w:r>
+            <w:r>
+              <w:t xml:space="preserve">and its checkpoint-and-resume model is the right design</w:t>
+            </w:r>
+            <w:r>
+              <w:t xml:space="preserve"> </w:t>
+            </w:r>
+            <w:r>
+              <w:t xml:space="preserve">for a long analysis pipeline that must survive interruption.</w:t>
+            </w:r>
+            <w:r>
+              <w:t xml:space="preserve"> </w:t>
+            </w:r>
+            <w:r>
+              <w:t xml:space="preserve">That is the one case where a lab member might reach for it:</w:t>
+            </w:r>
+            <w:r>
+              <w:t xml:space="preserve"> </w:t>
+            </w:r>
+            <w:r>
+              <w:t xml:space="preserve">a durable, multi-step Python pipeline with human sign-off in the middle.</w:t>
+            </w:r>
+            <w:r>
+              <w:t xml:space="preserve"> </w:t>
+            </w:r>
+            <w:r>
+              <w:t xml:space="preserve">For coordinating coding agents on a repository,</w:t>
+            </w:r>
+            <w:r>
+              <w:t xml:space="preserve"> </w:t>
+            </w:r>
+            <w:r>
+              <w:t xml:space="preserve">which is what we actually do,</w:t>
+            </w:r>
+            <w:r>
+              <w:t xml:space="preserve"> </w:t>
+            </w:r>
+            <w:r>
+              <w:t xml:space="preserve">it duplicates what Claude Code and the</w:t>
+            </w:r>
+            <w:r>
+              <w:t xml:space="preserve"> </w:t>
+            </w:r>
+            <w:r>
+              <w:rPr>
+                <w:rStyle w:val="VerbatimChar"/>
+              </w:rPr>
+              <w:t xml:space="preserve">Workflow</w:t>
+            </w:r>
+            <w:r>
+              <w:t xml:space="preserve"> </w:t>
+            </w:r>
+            <w:r>
+              <w:t xml:space="preserve">tool already provide.</w:t>
+            </w:r>
+          </w:p>
+          <w:p/>
+        </w:tc>
+      </w:tr>
+    </w:tbl>
+    <w:bookmarkEnd w:id="46"/>
+    <w:bookmarkStart w:id="50" w:name="sec-orch-crewai"/>
+    <w:p>
+      <w:pPr>
+        <w:pStyle w:val="Heading2"/>
+      </w:pPr>
+      <w:r>
+        <w:t xml:space="preserve">6.4 CrewAI</w:t>
+      </w:r>
+    </w:p>
+    <w:p>
+      <w:pPr>
+        <w:pStyle w:val="FirstParagraph"/>
+      </w:pPr>
+      <w:hyperlink r:id="rId47">
+        <w:r>
+          <w:rPr>
+            <w:rStyle w:val="Hyperlink"/>
+          </w:rPr>
+          <w:t xml:space="preserve">CrewAI</w:t>
+        </w:r>
+      </w:hyperlink>
+      <w:r>
+        <w:t xml:space="preserve"> </w:t>
+      </w:r>
+      <w:r>
+        <w:t xml:space="preserve">(CrewAI 2026b)</w:t>
+      </w:r>
+      <w:r>
+        <w:t xml:space="preserve"> </w:t>
+      </w:r>
+      <w:r>
+        <w:t xml:space="preserve">organizes agents by</w:t>
+      </w:r>
+      <w:r>
+        <w:t xml:space="preserve"> </w:t>
+      </w:r>
+      <w:r>
+        <w:rPr>
+          <w:b/>
+          <w:bCs/>
+        </w:rPr>
+        <w:t xml:space="preserve">role</w:t>
+      </w:r>
+      <w:r>
+        <w:t xml:space="preserve">.</w:t>
+      </w:r>
+      <w:r>
+        <w:t xml:space="preserve"> </w:t>
+      </w:r>
+      <w:r>
+        <w:t xml:space="preserve">A</w:t>
+      </w:r>
+      <w:r>
+        <w:t xml:space="preserve"> </w:t>
+      </w:r>
+      <w:r>
+        <w:rPr>
+          <w:i/>
+          <w:iCs/>
+        </w:rPr>
+        <w:t xml:space="preserve">crew</w:t>
+      </w:r>
+      <w:r>
+        <w:t xml:space="preserve"> </w:t>
+      </w:r>
+      <w:r>
+        <w:t xml:space="preserve">is a set of agents, each with a role, goal, and tools,</w:t>
+      </w:r>
+      <w:r>
+        <w:t xml:space="preserve"> </w:t>
+      </w:r>
+      <w:r>
+        <w:t xml:space="preserve">working through a list of tasks</w:t>
+      </w:r>
+      <w:r>
+        <w:t xml:space="preserve"> </w:t>
+      </w:r>
+      <w:r>
+        <w:t xml:space="preserve">either sequentially or under a manager agent (the hierarchical process),</w:t>
+      </w:r>
+      <w:r>
+        <w:t xml:space="preserve"> </w:t>
+      </w:r>
+      <w:r>
+        <w:t xml:space="preserve">delegating to each other as they see fit</w:t>
+      </w:r>
+      <w:r>
+        <w:t xml:space="preserve"> </w:t>
+      </w:r>
+      <w:r>
+        <w:t xml:space="preserve">(CrewAI 2026a)</w:t>
+      </w:r>
+      <w:r>
+        <w:t xml:space="preserve">.</w:t>
+      </w:r>
+      <w:r>
+        <w:t xml:space="preserve"> </w:t>
+      </w:r>
+      <w:r>
+        <w:t xml:space="preserve">A</w:t>
+      </w:r>
+      <w:r>
+        <w:t xml:space="preserve"> </w:t>
+      </w:r>
+      <w:r>
+        <w:rPr>
+          <w:i/>
+          <w:iCs/>
+        </w:rPr>
+        <w:t xml:space="preserve">flow</w:t>
+      </w:r>
+      <w:r>
+        <w:t xml:space="preserve"> </w:t>
+      </w:r>
+      <w:r>
+        <w:t xml:space="preserve">is the newer, event-driven layer</w:t>
+      </w:r>
+      <w:r>
+        <w:t xml:space="preserve"> </w:t>
+      </w:r>
+      <w:r>
+        <w:t xml:space="preserve">that manages state and decides when to run which crew.</w:t>
+      </w:r>
+      <w:r>
+        <w:t xml:space="preserve"> </w:t>
+      </w:r>
+      <w:r>
+        <w:t xml:space="preserve">It is Python-only, under the</w:t>
+      </w:r>
+      <w:r>
+        <w:t xml:space="preserve"> </w:t>
+      </w:r>
+      <w:r>
+        <w:rPr>
+          <w:b/>
+          <w:bCs/>
+        </w:rPr>
+        <w:t xml:space="preserve">MIT</w:t>
+      </w:r>
+      <w:r>
+        <w:t xml:space="preserve"> </w:t>
+      </w:r>
+      <w:r>
+        <w:t xml:space="preserve">license,</w:t>
+      </w:r>
+      <w:r>
+        <w:t xml:space="preserve"> </w:t>
+      </w:r>
+      <w:r>
+        <w:t xml:space="preserve">has about 58,300 stars,</w:t>
+      </w:r>
+      <w:r>
+        <w:t xml:space="preserve"> </w:t>
+      </w:r>
+      <w:r>
+        <w:t xml:space="preserve">and released version</w:t>
+      </w:r>
+      <w:r>
+        <w:t xml:space="preserve"> </w:t>
+      </w:r>
+      <w:r>
+        <w:rPr>
+          <w:rStyle w:val="VerbatimChar"/>
+        </w:rPr>
+        <w:t xml:space="preserve">1.15.20</w:t>
+      </w:r>
+      <w:r>
+        <w:t xml:space="preserve"> </w:t>
+      </w:r>
+      <w:r>
+        <w:t xml:space="preserve">on 2026-09-04 (measured 2026-09-09).</w:t>
+      </w:r>
+      <w:r>
+        <w:t xml:space="preserve"> </w:t>
+      </w:r>
+      <w:r>
+        <w:t xml:space="preserve">The open-source library sits under a commercial platform</w:t>
+      </w:r>
+      <w:r>
+        <w:t xml:space="preserve"> </w:t>
+      </w:r>
+      <w:r>
+        <w:t xml:space="preserve">for deploying and monitoring crews.</w:t>
+      </w:r>
+    </w:p>
+    <w:tbl>
+      <w:tblPr>
+        <w:tblStyle w:val="Table"/>
+        <w:tblLook w:firstRow="0" w:lastRow="0" w:firstColumn="0" w:lastColumn="0" w:noHBand="0" w:noVBand="0" w:val="0000"/>
+        <w:tblBorders>
+          <w:top w:val="single" w:sz="4" w:space="0" w:color="0758E5"/>
+          <w:left w:val="single" w:sz="24" w:space="0" w:color="0758E5"/>
+          <w:bottom w:val="single" w:sz="4" w:space="0" w:color="0758E5"/>
+          <w:right w:val="single" w:sz="4" w:space="0" w:color="0758E5"/>
+        </w:tblBorders>
+        <w:tblCellMar>
+          <w:left w:w="144" w:type="dxa"/>
+          <w:right w:w="144" w:type="dxa"/>
+        </w:tblCellMar>
+        <w:tblLook w:firstRow="0" w:lastRow="0" w:firstColumn="0" w:lastColumn="0" w:noHBand="0" w:noVBand="0" w:val="0000"/>
+      </w:tblPr>
+      <w:tr>
+        <w:trPr>
+          <w:cantSplit/>
+        </w:trPr>
+        <w:tc>
+          <w:tcPr>
+            <w:shd w:color="auto" w:fill="dae6fb" w:val="clear"/>
+            <w:tcMar>
+              <w:top w:w="92" w:type="dxa"/>
+              <w:bottom w:w="92" w:type="dxa"/>
+            </w:tcMar>
+          </w:tcPr>
+          <w:p>
+            <w:pPr>
+              <w:pStyle w:val="BodyText"/>
+            </w:pPr>
+            <w:pPr>
+              <w:spacing w:before="0" w:after="0"/>
+              <w:textAlignment w:val="center"/>
+            </w:pPr>
+            <w:r>
+              <w:drawing>
+                <wp:inline>
+                  <wp:extent cx="152400" cy="152400"/>
+                  <wp:effectExtent b="0" l="0" r="0" t="0"/>
+                  <wp:docPr descr="" title="" id="48" name="Picture"/>
+                  <a:graphic>
+                    <a:graphicData uri="http://schemas.openxmlformats.org/drawingml/2006/picture">
+                      <pic:pic>
+                        <pic:nvPicPr>
+                          <pic:cNvPr descr="/opt/quarto/share/formats/docx/note.png" id="49" name="Picture"/>
+                          <pic:cNvPicPr>
+                            <a:picLocks noChangeArrowheads="1" noChangeAspect="1"/>
+                          </pic:cNvPicPr>
+                        </pic:nvPicPr>
+                        <pic:blipFill>
+                          <a:blip r:embed="rId31"/>
+                          <a:stretch>
+                            <a:fillRect/>
+                          </a:stretch>
+                        </pic:blipFill>
+                        <pic:spPr bwMode="auto">
+                          <a:xfrm>
+                            <a:off x="0" y="0"/>
+                            <a:ext cx="152400" cy="152400"/>
+                          </a:xfrm>
+                          <a:prstGeom prst="rect">
+                            <a:avLst/>
+                          </a:prstGeom>
+                          <a:noFill/>
+                          <a:ln w="9525">
+                            <a:noFill/>
+                            <a:headEnd/>
+                            <a:tailEnd/>
+                          </a:ln>
+                        </pic:spPr>
+                      </pic:pic>
+                    </a:graphicData>
+                  </a:graphic>
+                </wp:inline>
+              </w:drawing>
+            </w:r>
+            <w:r>
+              <w:t xml:space="preserve"> </w:t>
+            </w:r>
+            <w:r>
+              <w:t xml:space="preserve"> </w:t>
+            </w:r>
+            <w:r>
+              <w:t xml:space="preserve">Useful to us? No</w:t>
+            </w:r>
+          </w:p>
+        </w:tc>
+      </w:tr>
+      <w:tr>
+        <w:trPr>
+          <w:cantSplit/>
+        </w:trPr>
+        <w:tc>
+          <w:tcPr>
+            <w:tcMar>
+              <w:top w:w="108" w:type="dxa"/>
+              <w:bottom w:w="108" w:type="dxa"/>
+            </w:tcMar>
+          </w:tcPr>
+          <w:p>
+            <w:pPr>
+              <w:pStyle w:val="BodyText"/>
+            </w:pPr>
+            <w:pPr>
+              <w:spacing w:before="16" w:after="16"/>
+            </w:pPr>
+            <w:r>
+              <w:t xml:space="preserve">The role-playing metaphor is easy to start with</w:t>
+            </w:r>
+            <w:r>
+              <w:t xml:space="preserve"> </w:t>
+            </w:r>
+            <w:r>
+              <w:t xml:space="preserve">and is the same thing our subagent definitions do</w:t>
+            </w:r>
+            <w:r>
+              <w:t xml:space="preserve"> </w:t>
+            </w:r>
+            <w:r>
+              <w:t xml:space="preserve">(a reviewer role, a search role, a verification role),</w:t>
+            </w:r>
+            <w:r>
+              <w:t xml:space="preserve"> </w:t>
+            </w:r>
+            <w:r>
+              <w:t xml:space="preserve">with less control over what each agent may touch.</w:t>
+            </w:r>
+            <w:r>
+              <w:t xml:space="preserve"> </w:t>
+            </w:r>
+            <w:r>
+              <w:t xml:space="preserve">Nothing here is missing from our stack.</w:t>
+            </w:r>
+          </w:p>
+          <w:p/>
+        </w:tc>
+      </w:tr>
+    </w:tbl>
+    <w:bookmarkEnd w:id="50"/>
+    <w:bookmarkStart w:id="54" w:name="sec-orch-openai-agents"/>
+    <w:p>
+      <w:pPr>
+        <w:pStyle w:val="Heading2"/>
+      </w:pPr>
+      <w:r>
+        <w:t xml:space="preserve">6.5 OpenAI Agents SDK</w:t>
+      </w:r>
+    </w:p>
+    <w:p>
+      <w:pPr>
+        <w:pStyle w:val="FirstParagraph"/>
+      </w:pPr>
+      <w:r>
+        <w:t xml:space="preserve">The</w:t>
+      </w:r>
+      <w:r>
+        <w:t xml:space="preserve"> </w:t>
+      </w:r>
+      <w:hyperlink r:id="rId51">
+        <w:r>
+          <w:rPr>
+            <w:rStyle w:val="Hyperlink"/>
+          </w:rPr>
+          <w:t xml:space="preserve">OpenAI Agents SDK</w:t>
+        </w:r>
+      </w:hyperlink>
+      <w:r>
+        <w:t xml:space="preserve"> </w:t>
+      </w:r>
+      <w:r>
+        <w:t xml:space="preserve">(OpenAI 2026)</w:t>
+      </w:r>
+      <w:r>
+        <w:t xml:space="preserve"> </w:t>
+      </w:r>
+      <w:r>
+        <w:t xml:space="preserve">is a deliberately small framework</w:t>
+      </w:r>
+      <w:r>
+        <w:t xml:space="preserve"> </w:t>
+      </w:r>
+      <w:r>
+        <w:t xml:space="preserve">built around a few primitives:</w:t>
+      </w:r>
+      <w:r>
+        <w:t xml:space="preserve"> </w:t>
+      </w:r>
+      <w:r>
+        <w:t xml:space="preserve">agents,</w:t>
+      </w:r>
+      <w:r>
+        <w:t xml:space="preserve"> </w:t>
+      </w:r>
+      <w:r>
+        <w:rPr>
+          <w:b/>
+          <w:bCs/>
+        </w:rPr>
+        <w:t xml:space="preserve">handoff</w:t>
+      </w:r>
+      <w:r>
+        <w:t xml:space="preserve"> </w:t>
+      </w:r>
+      <w:r>
+        <w:t xml:space="preserve">between agents, agents used as tools,</w:t>
+      </w:r>
+      <w:r>
+        <w:t xml:space="preserve"> </w:t>
+      </w:r>
+      <w:r>
+        <w:t xml:space="preserve">guardrails on input and output,</w:t>
+      </w:r>
+      <w:r>
+        <w:t xml:space="preserve"> </w:t>
+      </w:r>
+      <w:r>
+        <w:t xml:space="preserve">sessions for conversation history,</w:t>
+      </w:r>
+      <w:r>
+        <w:t xml:space="preserve"> </w:t>
+      </w:r>
+      <w:r>
+        <w:t xml:space="preserve">human-in-the-loop hooks,</w:t>
+      </w:r>
+      <w:r>
+        <w:t xml:space="preserve"> </w:t>
+      </w:r>
+      <w:r>
+        <w:t xml:space="preserve">and tracing.</w:t>
+      </w:r>
+      <w:r>
+        <w:t xml:space="preserve"> </w:t>
+      </w:r>
+      <w:r>
+        <w:t xml:space="preserve">Newer additions include sandbox agents</w:t>
+      </w:r>
+      <w:r>
+        <w:t xml:space="preserve"> </w:t>
+      </w:r>
+      <w:r>
+        <w:t xml:space="preserve">that work inside a container over long tasks.</w:t>
+      </w:r>
+      <w:r>
+        <w:t xml:space="preserve"> </w:t>
+      </w:r>
+      <w:r>
+        <w:t xml:space="preserve">Despite the name, it is provider-agnostic</w:t>
+      </w:r>
+      <w:r>
+        <w:t xml:space="preserve"> </w:t>
+      </w:r>
+      <w:r>
+        <w:t xml:space="preserve">and works with any Chat Completions-compatible model</w:t>
+      </w:r>
+      <w:r>
+        <w:t xml:space="preserve"> </w:t>
+      </w:r>
+      <w:r>
+        <w:t xml:space="preserve">and</w:t>
+      </w:r>
+      <w:r>
+        <w:t xml:space="preserve"> </w:t>
+      </w:r>
+      <w:r>
+        <w:t xml:space="preserve">“100+ other LLMs”</w:t>
+      </w:r>
+      <w:r>
+        <w:t xml:space="preserve">.</w:t>
+      </w:r>
+      <w:r>
+        <w:t xml:space="preserve"> </w:t>
+      </w:r>
+      <w:r>
+        <w:t xml:space="preserve">It is Python (3.10 or later), with a separate TypeScript package,</w:t>
+      </w:r>
+      <w:r>
+        <w:t xml:space="preserve"> </w:t>
+      </w:r>
+      <w:r>
+        <w:t xml:space="preserve">under the</w:t>
+      </w:r>
+      <w:r>
+        <w:t xml:space="preserve"> </w:t>
+      </w:r>
+      <w:r>
+        <w:rPr>
+          <w:b/>
+          <w:bCs/>
+        </w:rPr>
+        <w:t xml:space="preserve">MIT</w:t>
+      </w:r>
+      <w:r>
+        <w:t xml:space="preserve"> </w:t>
+      </w:r>
+      <w:r>
+        <w:t xml:space="preserve">license,</w:t>
+      </w:r>
+      <w:r>
+        <w:t xml:space="preserve"> </w:t>
+      </w:r>
+      <w:r>
+        <w:t xml:space="preserve">with about 29,300 stars</w:t>
+      </w:r>
+      <w:r>
+        <w:t xml:space="preserve"> </w:t>
+      </w:r>
+      <w:r>
+        <w:t xml:space="preserve">and version</w:t>
+      </w:r>
+      <w:r>
+        <w:t xml:space="preserve"> </w:t>
+      </w:r>
+      <w:r>
+        <w:rPr>
+          <w:rStyle w:val="VerbatimChar"/>
+        </w:rPr>
+        <w:t xml:space="preserve">v0.22.2</w:t>
+      </w:r>
+      <w:r>
+        <w:t xml:space="preserve"> </w:t>
+      </w:r>
+      <w:r>
+        <w:t xml:space="preserve">released on 2026-09-09 (measured the same day).</w:t>
+      </w:r>
+    </w:p>
+    <w:tbl>
+      <w:tblPr>
+        <w:tblStyle w:val="Table"/>
+        <w:tblLook w:firstRow="0" w:lastRow="0" w:firstColumn="0" w:lastColumn="0" w:noHBand="0" w:noVBand="0" w:val="0000"/>
+        <w:tblBorders>
+          <w:top w:val="single" w:sz="4" w:space="0" w:color="0758E5"/>
+          <w:left w:val="single" w:sz="24" w:space="0" w:color="0758E5"/>
+          <w:bottom w:val="single" w:sz="4" w:space="0" w:color="0758E5"/>
+          <w:right w:val="single" w:sz="4" w:space="0" w:color="0758E5"/>
+        </w:tblBorders>
+        <w:tblCellMar>
+          <w:left w:w="144" w:type="dxa"/>
+          <w:right w:w="144" w:type="dxa"/>
+        </w:tblCellMar>
+        <w:tblLook w:firstRow="0" w:lastRow="0" w:firstColumn="0" w:lastColumn="0" w:noHBand="0" w:noVBand="0" w:val="0000"/>
+      </w:tblPr>
+      <w:tr>
+        <w:trPr>
+          <w:cantSplit/>
+        </w:trPr>
+        <w:tc>
+          <w:tcPr>
+            <w:shd w:color="auto" w:fill="dae6fb" w:val="clear"/>
+            <w:tcMar>
+              <w:top w:w="92" w:type="dxa"/>
+              <w:bottom w:w="92" w:type="dxa"/>
+            </w:tcMar>
+          </w:tcPr>
+          <w:p>
+            <w:pPr>
+              <w:pStyle w:val="BodyText"/>
+            </w:pPr>
+            <w:pPr>
+              <w:spacing w:before="0" w:after="0"/>
+              <w:textAlignment w:val="center"/>
+            </w:pPr>
+            <w:r>
+              <w:drawing>
+                <wp:inline>
+                  <wp:extent cx="152400" cy="152400"/>
+                  <wp:effectExtent b="0" l="0" r="0" t="0"/>
+                  <wp:docPr descr="" title="" id="52" name="Picture"/>
+                  <a:graphic>
+                    <a:graphicData uri="http://schemas.openxmlformats.org/drawingml/2006/picture">
+                      <pic:pic>
+                        <pic:nvPicPr>
+                          <pic:cNvPr descr="/opt/quarto/share/formats/docx/note.png" id="53" name="Picture"/>
+                          <pic:cNvPicPr>
+                            <a:picLocks noChangeArrowheads="1" noChangeAspect="1"/>
+                          </pic:cNvPicPr>
+                        </pic:nvPicPr>
+                        <pic:blipFill>
+                          <a:blip r:embed="rId31"/>
+                          <a:stretch>
+                            <a:fillRect/>
+                          </a:stretch>
+                        </pic:blipFill>
+                        <pic:spPr bwMode="auto">
+                          <a:xfrm>
+                            <a:off x="0" y="0"/>
+                            <a:ext cx="152400" cy="152400"/>
+                          </a:xfrm>
+                          <a:prstGeom prst="rect">
+                            <a:avLst/>
+                          </a:prstGeom>
+                          <a:noFill/>
+                          <a:ln w="9525">
+                            <a:noFill/>
+                            <a:headEnd/>
+                            <a:tailEnd/>
+                          </a:ln>
+                        </pic:spPr>
+                      </pic:pic>
+                    </a:graphicData>
+                  </a:graphic>
+                </wp:inline>
+              </w:drawing>
+            </w:r>
+            <w:r>
+              <w:t xml:space="preserve"> </w:t>
+            </w:r>
+            <w:r>
+              <w:t xml:space="preserve"> </w:t>
+            </w:r>
+            <w:r>
+              <w:t xml:space="preserve">Useful to us? No</w:t>
+            </w:r>
+          </w:p>
+        </w:tc>
+      </w:tr>
+      <w:tr>
+        <w:trPr>
+          <w:cantSplit/>
+        </w:trPr>
+        <w:tc>
+          <w:tcPr>
+            <w:tcMar>
+              <w:top w:w="108" w:type="dxa"/>
+              <w:bottom w:w="108" w:type="dxa"/>
+            </w:tcMar>
+          </w:tcPr>
+          <w:p>
+            <w:pPr>
+              <w:pStyle w:val="BodyText"/>
+            </w:pPr>
+            <w:pPr>
+              <w:spacing w:before="16" w:after="16"/>
+            </w:pPr>
+            <w:r>
+              <w:t xml:space="preserve">This is the OpenAI-side counterpart to Anthropic’s Claude Agent SDK,</w:t>
+            </w:r>
+            <w:r>
+              <w:t xml:space="preserve"> </w:t>
+            </w:r>
+            <w:r>
+              <w:t xml:space="preserve">and it would matter only if we built automation around Codex</w:t>
+            </w:r>
+            <w:r>
+              <w:t xml:space="preserve"> </w:t>
+            </w:r>
+            <w:r>
+              <w:t xml:space="preserve">rather than Claude Code.</w:t>
+            </w:r>
+            <w:r>
+              <w:t xml:space="preserve"> </w:t>
+            </w:r>
+            <w:r>
+              <w:t xml:space="preserve">Its handoff and guardrail design is worth reading as a reference,</w:t>
+            </w:r>
+            <w:r>
+              <w:t xml:space="preserve"> </w:t>
+            </w:r>
+            <w:r>
+              <w:t xml:space="preserve">since it is the simplest statement of those ideas on this list.</w:t>
+            </w:r>
+          </w:p>
+          <w:p/>
+        </w:tc>
+      </w:tr>
+    </w:tbl>
+    <w:bookmarkEnd w:id="54"/>
+    <w:bookmarkStart w:id="58" w:name="sec-orch-adk"/>
+    <w:p>
+      <w:pPr>
+        <w:pStyle w:val="Heading2"/>
+      </w:pPr>
+      <w:r>
+        <w:t xml:space="preserve">6.6 Google Agent Development Kit</w:t>
+      </w:r>
+    </w:p>
+    <w:p>
+      <w:pPr>
+        <w:pStyle w:val="FirstParagraph"/>
+      </w:pPr>
+      <w:r>
+        <w:t xml:space="preserve">Google’s</w:t>
+      </w:r>
+      <w:r>
+        <w:t xml:space="preserve"> </w:t>
+      </w:r>
+      <w:hyperlink r:id="rId55">
+        <w:r>
+          <w:rPr>
+            <w:rStyle w:val="Hyperlink"/>
+          </w:rPr>
+          <w:t xml:space="preserve">Agent Development Kit</w:t>
+        </w:r>
+      </w:hyperlink>
+      <w:r>
+        <w:t xml:space="preserve"> </w:t>
+      </w:r>
+      <w:r>
+        <w:t xml:space="preserve">(Google 2026)</w:t>
+      </w:r>
+      <w:r>
+        <w:t xml:space="preserve"> </w:t>
+      </w:r>
+      <w:r>
+        <w:t xml:space="preserve">(ADK) is a</w:t>
+      </w:r>
+      <w:r>
+        <w:t xml:space="preserve"> </w:t>
+      </w:r>
+      <w:r>
+        <w:t xml:space="preserve">“code-first Python framework for building, evaluating, and deploying”</w:t>
+      </w:r>
+      <w:r>
+        <w:t xml:space="preserve"> </w:t>
+      </w:r>
+      <w:r>
+        <w:t xml:space="preserve">agents.</w:t>
+      </w:r>
+      <w:r>
+        <w:t xml:space="preserve"> </w:t>
+      </w:r>
+      <w:r>
+        <w:t xml:space="preserve">Version 2.0 expresses orchestration two ways:</w:t>
+      </w:r>
+      <w:r>
+        <w:t xml:space="preserve"> </w:t>
+      </w:r>
+      <w:r>
+        <w:t xml:space="preserve">a graph-based</w:t>
+      </w:r>
+      <w:r>
+        <w:t xml:space="preserve"> </w:t>
+      </w:r>
+      <w:r>
+        <w:rPr>
+          <w:b/>
+          <w:bCs/>
+        </w:rPr>
+        <w:t xml:space="preserve">workflow runtime</w:t>
+      </w:r>
+      <w:r>
+        <w:t xml:space="preserve"> </w:t>
+      </w:r>
+      <w:r>
+        <w:t xml:space="preserve">(routing, fan-out and fan-in, loops, retries, nested workflows, human-in-the-loop)</w:t>
+      </w:r>
+      <w:r>
+        <w:t xml:space="preserve"> </w:t>
+      </w:r>
+      <w:r>
+        <w:t xml:space="preserve">and a</w:t>
+      </w:r>
+      <w:r>
+        <w:t xml:space="preserve"> </w:t>
+      </w:r>
+      <w:r>
+        <w:rPr>
+          <w:b/>
+          <w:bCs/>
+        </w:rPr>
+        <w:t xml:space="preserve">task API</w:t>
+      </w:r>
+      <w:r>
+        <w:t xml:space="preserve"> </w:t>
+      </w:r>
+      <w:r>
+        <w:t xml:space="preserve">for structured delegation between agents</w:t>
+      </w:r>
+      <w:r>
+        <w:t xml:space="preserve"> </w:t>
+      </w:r>
+      <w:r>
+        <w:t xml:space="preserve">arranged in hierarchies.</w:t>
+      </w:r>
+      <w:r>
+        <w:t xml:space="preserve"> </w:t>
+      </w:r>
+      <w:r>
+        <w:t xml:space="preserve">It is optimized for Gemini but model-agnostic,</w:t>
+      </w:r>
+      <w:r>
+        <w:t xml:space="preserve"> </w:t>
+      </w:r>
+      <w:r>
+        <w:t xml:space="preserve">ships ports for Java, Kotlin, Go, and TypeScript,</w:t>
+      </w:r>
+      <w:r>
+        <w:t xml:space="preserve"> </w:t>
+      </w:r>
+      <w:r>
+        <w:t xml:space="preserve">and deploys to Cloud Run or Vertex AI Agent Engine.</w:t>
+      </w:r>
+      <w:r>
+        <w:t xml:space="preserve"> </w:t>
+      </w:r>
+      <w:r>
+        <w:t xml:space="preserve">It is under the</w:t>
+      </w:r>
+      <w:r>
+        <w:t xml:space="preserve"> </w:t>
+      </w:r>
+      <w:r>
+        <w:rPr>
+          <w:b/>
+          <w:bCs/>
+        </w:rPr>
+        <w:t xml:space="preserve">Apache-2.0</w:t>
+      </w:r>
+      <w:r>
+        <w:t xml:space="preserve"> </w:t>
+      </w:r>
+      <w:r>
+        <w:t xml:space="preserve">license,</w:t>
+      </w:r>
+      <w:r>
+        <w:t xml:space="preserve"> </w:t>
+      </w:r>
+      <w:r>
+        <w:t xml:space="preserve">has about 21,500 stars,</w:t>
+      </w:r>
+      <w:r>
+        <w:t xml:space="preserve"> </w:t>
+      </w:r>
+      <w:r>
+        <w:t xml:space="preserve">and released</w:t>
+      </w:r>
+      <w:r>
+        <w:t xml:space="preserve"> </w:t>
+      </w:r>
+      <w:r>
+        <w:rPr>
+          <w:rStyle w:val="VerbatimChar"/>
+        </w:rPr>
+        <w:t xml:space="preserve">v2.8.0</w:t>
+      </w:r>
+      <w:r>
+        <w:t xml:space="preserve"> </w:t>
+      </w:r>
+      <w:r>
+        <w:t xml:space="preserve">on 2026-08-26</w:t>
+      </w:r>
+      <w:r>
+        <w:t xml:space="preserve"> </w:t>
+      </w:r>
+      <w:r>
+        <w:t xml:space="preserve">on a roughly two-week cadence (measured 2026-09-09).</w:t>
+      </w:r>
+    </w:p>
+    <w:tbl>
+      <w:tblPr>
+        <w:tblStyle w:val="Table"/>
+        <w:tblLook w:firstRow="0" w:lastRow="0" w:firstColumn="0" w:lastColumn="0" w:noHBand="0" w:noVBand="0" w:val="0000"/>
+        <w:tblBorders>
+          <w:top w:val="single" w:sz="4" w:space="0" w:color="0758E5"/>
+          <w:left w:val="single" w:sz="24" w:space="0" w:color="0758E5"/>
+          <w:bottom w:val="single" w:sz="4" w:space="0" w:color="0758E5"/>
+          <w:right w:val="single" w:sz="4" w:space="0" w:color="0758E5"/>
+        </w:tblBorders>
+        <w:tblCellMar>
+          <w:left w:w="144" w:type="dxa"/>
+          <w:right w:w="144" w:type="dxa"/>
+        </w:tblCellMar>
+        <w:tblLook w:firstRow="0" w:lastRow="0" w:firstColumn="0" w:lastColumn="0" w:noHBand="0" w:noVBand="0" w:val="0000"/>
+      </w:tblPr>
+      <w:tr>
+        <w:trPr>
+          <w:cantSplit/>
+        </w:trPr>
+        <w:tc>
+          <w:tcPr>
+            <w:shd w:color="auto" w:fill="dae6fb" w:val="clear"/>
+            <w:tcMar>
+              <w:top w:w="92" w:type="dxa"/>
+              <w:bottom w:w="92" w:type="dxa"/>
+            </w:tcMar>
+          </w:tcPr>
+          <w:p>
+            <w:pPr>
+              <w:pStyle w:val="BodyText"/>
+            </w:pPr>
+            <w:pPr>
+              <w:spacing w:before="0" w:after="0"/>
+              <w:textAlignment w:val="center"/>
+            </w:pPr>
+            <w:r>
+              <w:drawing>
+                <wp:inline>
+                  <wp:extent cx="152400" cy="152400"/>
+                  <wp:effectExtent b="0" l="0" r="0" t="0"/>
+                  <wp:docPr descr="" title="" id="56" name="Picture"/>
+                  <a:graphic>
+                    <a:graphicData uri="http://schemas.openxmlformats.org/drawingml/2006/picture">
+                      <pic:pic>
+                        <pic:nvPicPr>
+                          <pic:cNvPr descr="/opt/quarto/share/formats/docx/note.png" id="57" name="Picture"/>
+                          <pic:cNvPicPr>
+                            <a:picLocks noChangeArrowheads="1" noChangeAspect="1"/>
+                          </pic:cNvPicPr>
+                        </pic:nvPicPr>
+                        <pic:blipFill>
+                          <a:blip r:embed="rId31"/>
+                          <a:stretch>
+                            <a:fillRect/>
+                          </a:stretch>
+                        </pic:blipFill>
+                        <pic:spPr bwMode="auto">
+                          <a:xfrm>
+                            <a:off x="0" y="0"/>
+                            <a:ext cx="152400" cy="152400"/>
+                          </a:xfrm>
+                          <a:prstGeom prst="rect">
+                            <a:avLst/>
+                          </a:prstGeom>
+                          <a:noFill/>
+                          <a:ln w="9525">
+                            <a:noFill/>
+                            <a:headEnd/>
+                            <a:tailEnd/>
+                          </a:ln>
+                        </pic:spPr>
+                      </pic:pic>
+                    </a:graphicData>
+                  </a:graphic>
+                </wp:inline>
+              </w:drawing>
+            </w:r>
+            <w:r>
+              <w:t xml:space="preserve"> </w:t>
+            </w:r>
+            <w:r>
+              <w:t xml:space="preserve"> </w:t>
+            </w:r>
+            <w:r>
+              <w:t xml:space="preserve">Useful to us? No</w:t>
+            </w:r>
+          </w:p>
+        </w:tc>
+      </w:tr>
+      <w:tr>
+        <w:trPr>
+          <w:cantSplit/>
+        </w:trPr>
+        <w:tc>
+          <w:tcPr>
+            <w:tcMar>
+              <w:top w:w="108" w:type="dxa"/>
+              <w:bottom w:w="108" w:type="dxa"/>
+            </w:tcMar>
+          </w:tcPr>
+          <w:p>
+            <w:pPr>
+              <w:pStyle w:val="BodyText"/>
+            </w:pPr>
+            <w:pPr>
+              <w:spacing w:before="16" w:after="16"/>
+            </w:pPr>
+            <w:r>
+              <w:t xml:space="preserve">ADK is the most complete of the vendor frameworks on paper,</w:t>
+            </w:r>
+            <w:r>
+              <w:t xml:space="preserve"> </w:t>
+            </w:r>
+            <w:r>
+              <w:t xml:space="preserve">and the least relevant to us in practice:</w:t>
+            </w:r>
+            <w:r>
+              <w:t xml:space="preserve"> </w:t>
+            </w:r>
+            <w:r>
+              <w:t xml:space="preserve">its strengths are Gemini and Google Cloud deployment,</w:t>
+            </w:r>
+            <w:r>
+              <w:t xml:space="preserve"> </w:t>
+            </w:r>
+            <w:r>
+              <w:t xml:space="preserve">neither of which we use.</w:t>
+            </w:r>
+          </w:p>
+          <w:p/>
+        </w:tc>
+      </w:tr>
+    </w:tbl>
+    <w:bookmarkEnd w:id="58"/>
+    <w:bookmarkStart w:id="64" w:name="sec-orch-others"/>
+    <w:p>
+      <w:pPr>
+        <w:pStyle w:val="Heading2"/>
+      </w:pPr>
+      <w:r>
+        <w:t xml:space="preserve">6.7 Others</w:t>
+      </w:r>
+    </w:p>
+    <w:p>
+      <w:pPr>
+        <w:pStyle w:val="FirstParagraph"/>
+      </w:pPr>
+      <w:r>
+        <w:t xml:space="preserve">Several more frameworks come up in the same conversations.</w:t>
+      </w:r>
+      <w:r>
+        <w:t xml:space="preserve"> </w:t>
+      </w:r>
+      <w:r>
+        <w:t xml:space="preserve">None changes the verdicts above,</w:t>
+      </w:r>
+      <w:r>
+        <w:t xml:space="preserve"> </w:t>
+      </w:r>
+      <w:r>
+        <w:t xml:space="preserve">so they get one line each</w:t>
+      </w:r>
+      <w:r>
+        <w:t xml:space="preserve"> </w:t>
+      </w:r>
+      <w:r>
+        <w:t xml:space="preserve">(stars and dates measured 2026-09-09):</w:t>
+      </w:r>
+    </w:p>
+    <w:p>
+      <w:pPr>
+        <w:pStyle w:val="Compact"/>
+        <w:numPr>
+          <w:ilvl w:val="0"/>
+          <w:numId w:val="1004"/>
+        </w:numPr>
+      </w:pPr>
+      <w:hyperlink r:id="rId59">
+        <w:r>
+          <w:rPr>
+            <w:rStyle w:val="VerbatimChar"/>
+          </w:rPr>
+          <w:t xml:space="preserve">MetaGPT</w:t>
+        </w:r>
+      </w:hyperlink>
+      <w:r>
+        <w:t xml:space="preserve"> </w:t>
+      </w:r>
+      <w:r>
+        <w:t xml:space="preserve">(FoundationAgents 2026)</w:t>
+      </w:r>
+      <w:r>
+        <w:t xml:space="preserve">:</w:t>
+      </w:r>
+      <w:r>
+        <w:t xml:space="preserve"> </w:t>
+      </w:r>
+      <w:r>
+        <w:t xml:space="preserve">the most-starred project on this list (about 70,300),</w:t>
+      </w:r>
+      <w:r>
+        <w:t xml:space="preserve"> </w:t>
+      </w:r>
+      <w:r>
+        <w:t xml:space="preserve">simulating a software company of role agents;</w:t>
+      </w:r>
+      <w:r>
+        <w:t xml:space="preserve"> </w:t>
+      </w:r>
+      <w:r>
+        <w:t xml:space="preserve">MIT, Python,</w:t>
+      </w:r>
+      <w:r>
+        <w:t xml:space="preserve"> </w:t>
+      </w:r>
+      <w:r>
+        <w:t xml:space="preserve">but its last release was</w:t>
+      </w:r>
+      <w:r>
+        <w:t xml:space="preserve"> </w:t>
+      </w:r>
+      <w:r>
+        <w:rPr>
+          <w:rStyle w:val="VerbatimChar"/>
+        </w:rPr>
+        <w:t xml:space="preserve">v0.8.1</w:t>
+      </w:r>
+      <w:r>
+        <w:t xml:space="preserve"> </w:t>
+      </w:r>
+      <w:r>
+        <w:t xml:space="preserve">in April 2024</w:t>
+      </w:r>
+      <w:r>
+        <w:t xml:space="preserve"> </w:t>
+      </w:r>
+      <w:r>
+        <w:t xml:space="preserve">and its last push was January 2026.</w:t>
+      </w:r>
+    </w:p>
+    <w:p>
+      <w:pPr>
+        <w:pStyle w:val="Compact"/>
+        <w:numPr>
+          <w:ilvl w:val="0"/>
+          <w:numId w:val="1004"/>
+        </w:numPr>
+      </w:pPr>
+      <w:hyperlink r:id="rId60">
+        <w:r>
+          <w:rPr>
+            <w:rStyle w:val="VerbatimChar"/>
+          </w:rPr>
+          <w:t xml:space="preserve">LlamaIndex</w:t>
+        </w:r>
+      </w:hyperlink>
+      <w:r>
+        <w:t xml:space="preserve"> </w:t>
+      </w:r>
+      <w:r>
+        <w:t xml:space="preserve">(LlamaIndex 2026)</w:t>
+      </w:r>
+      <w:r>
+        <w:t xml:space="preserve">:</w:t>
+      </w:r>
+      <w:r>
+        <w:t xml:space="preserve"> </w:t>
+      </w:r>
+      <w:r>
+        <w:t xml:space="preserve">document-centric agents and event-driven workflows;</w:t>
+      </w:r>
+      <w:r>
+        <w:t xml:space="preserve"> </w:t>
+      </w:r>
+      <w:r>
+        <w:t xml:space="preserve">MIT, Python, about 52,100 stars, actively released.</w:t>
+      </w:r>
+    </w:p>
+    <w:p>
+      <w:pPr>
+        <w:pStyle w:val="Compact"/>
+        <w:numPr>
+          <w:ilvl w:val="0"/>
+          <w:numId w:val="1004"/>
+        </w:numPr>
+      </w:pPr>
+      <w:hyperlink r:id="rId61">
+        <w:r>
+          <w:rPr>
+            <w:rStyle w:val="VerbatimChar"/>
+          </w:rPr>
+          <w:t xml:space="preserve">smolagents</w:t>
+        </w:r>
+      </w:hyperlink>
+      <w:r>
+        <w:t xml:space="preserve"> </w:t>
+      </w:r>
+      <w:r>
+        <w:t xml:space="preserve">(Hugging Face 2026)</w:t>
+      </w:r>
+      <w:r>
+        <w:t xml:space="preserve">:</w:t>
+      </w:r>
+      <w:r>
+        <w:t xml:space="preserve"> </w:t>
+      </w:r>
+      <w:r>
+        <w:t xml:space="preserve">Hugging Face’s minimal library for agents that act by writing code;</w:t>
+      </w:r>
+      <w:r>
+        <w:t xml:space="preserve"> </w:t>
+      </w:r>
+      <w:r>
+        <w:t xml:space="preserve">Apache-2.0, Python, about 29,300 stars.</w:t>
+      </w:r>
+    </w:p>
+    <w:p>
+      <w:pPr>
+        <w:pStyle w:val="Compact"/>
+        <w:numPr>
+          <w:ilvl w:val="0"/>
+          <w:numId w:val="1004"/>
+        </w:numPr>
+      </w:pPr>
+      <w:hyperlink r:id="rId62">
+        <w:r>
+          <w:rPr>
+            <w:rStyle w:val="VerbatimChar"/>
+          </w:rPr>
+          <w:t xml:space="preserve">Pydantic AI</w:t>
+        </w:r>
+      </w:hyperlink>
+      <w:r>
+        <w:t xml:space="preserve"> </w:t>
+      </w:r>
+      <w:r>
+        <w:t xml:space="preserve">(Pydantic 2026)</w:t>
+      </w:r>
+      <w:r>
+        <w:t xml:space="preserve">:</w:t>
+      </w:r>
+      <w:r>
+        <w:t xml:space="preserve"> </w:t>
+      </w:r>
+      <w:r>
+        <w:t xml:space="preserve">typed, single-agent-first design from the</w:t>
+      </w:r>
+      <w:r>
+        <w:t xml:space="preserve"> </w:t>
+      </w:r>
+      <w:r>
+        <w:rPr>
+          <w:rStyle w:val="VerbatimChar"/>
+        </w:rPr>
+        <w:t xml:space="preserve">Pydantic</w:t>
+      </w:r>
+      <w:r>
+        <w:t xml:space="preserve"> </w:t>
+      </w:r>
+      <w:r>
+        <w:t xml:space="preserve">team;</w:t>
+      </w:r>
+      <w:r>
+        <w:t xml:space="preserve"> </w:t>
+      </w:r>
+      <w:r>
+        <w:t xml:space="preserve">MIT, Python, about 19,800 stars, released daily.</w:t>
+      </w:r>
+    </w:p>
+    <w:p>
+      <w:pPr>
+        <w:pStyle w:val="Compact"/>
+        <w:numPr>
+          <w:ilvl w:val="0"/>
+          <w:numId w:val="1004"/>
+        </w:numPr>
+      </w:pPr>
+      <w:hyperlink r:id="rId63">
+        <w:r>
+          <w:rPr>
+            <w:rStyle w:val="VerbatimChar"/>
+          </w:rPr>
+          <w:t xml:space="preserve">CAMEL</w:t>
+        </w:r>
+      </w:hyperlink>
+      <w:r>
+        <w:t xml:space="preserve"> </w:t>
+      </w:r>
+      <w:r>
+        <w:t xml:space="preserve">(CAMEL-AI 2026)</w:t>
+      </w:r>
+      <w:r>
+        <w:t xml:space="preserve">:</w:t>
+      </w:r>
+      <w:r>
+        <w:t xml:space="preserve"> </w:t>
+      </w:r>
+      <w:r>
+        <w:t xml:space="preserve">a research-oriented multi-agent framework;</w:t>
+      </w:r>
+      <w:r>
+        <w:t xml:space="preserve"> </w:t>
+      </w:r>
+      <w:r>
+        <w:t xml:space="preserve">Apache-2.0, Python, about 17,700 stars.</w:t>
+      </w:r>
+    </w:p>
+    <w:p>
+      <w:pPr>
+        <w:pStyle w:val="Compact"/>
+        <w:numPr>
+          <w:ilvl w:val="0"/>
+          <w:numId w:val="1004"/>
+        </w:numPr>
+      </w:pPr>
+      <w:r>
+        <w:rPr>
+          <w:rStyle w:val="VerbatimChar"/>
+        </w:rPr>
+        <w:t xml:space="preserve">VoltAgent</w:t>
+      </w:r>
+      <w:r>
+        <w:t xml:space="preserve">: a TypeScript framework, tracked separately in issue #45</w:t>
+      </w:r>
+      <w:r>
+        <w:t xml:space="preserve"> </w:t>
+      </w:r>
+      <w:r>
+        <w:t xml:space="preserve">of this site’s repository.</w:t>
+      </w:r>
+    </w:p>
+    <w:bookmarkEnd w:id="64"/>
+    <w:bookmarkEnd w:id="65"/>
+    <w:bookmarkStart w:id="66" w:name="sec-orch-comparison"/>
+    <w:p>
+      <w:pPr>
+        <w:pStyle w:val="Heading1"/>
+      </w:pPr>
+      <w:r>
+        <w:t xml:space="preserve">7. Comparison</w:t>
       </w:r>
     </w:p>
     <w:p>
@@ -2488,14 +5107,96 @@
         </w:tc>
       </w:tr>
     </w:tbl>
-    <w:bookmarkEnd w:id="35"/>
-    <w:bookmarkStart w:id="36" w:name="sec-orch-recommendation"/>
+    <w:p>
+      <w:pPr>
+        <w:pStyle w:val="BodyText"/>
+      </w:pPr>
+      <w:r>
+        <w:t xml:space="preserve">The frameworks in</w:t>
+      </w:r>
+      <w:r>
+        <w:t xml:space="preserve"> </w:t>
+      </w:r>
+      <w:hyperlink w:anchor="sec-orch-frameworks">
+        <w:r>
+          <w:rPr>
+            <w:rStyle w:val="Hyperlink"/>
+          </w:rPr>
+          <w:t xml:space="preserve">Section 6</w:t>
+        </w:r>
+      </w:hyperlink>
+      <w:r>
+        <w:t xml:space="preserve"> </w:t>
+      </w:r>
+      <w:r>
+        <w:t xml:space="preserve">do not fit this table,</w:t>
+      </w:r>
+      <w:r>
+        <w:t xml:space="preserve"> </w:t>
+      </w:r>
+      <w:r>
+        <w:t xml:space="preserve">because they are libraries rather than tools:</w:t>
+      </w:r>
+      <w:r>
+        <w:t xml:space="preserve"> </w:t>
+      </w:r>
+      <w:r>
+        <w:t xml:space="preserve">each would be a column only after we had built something with it.</w:t>
+      </w:r>
+      <w:r>
+        <w:t xml:space="preserve"> </w:t>
+      </w:r>
+      <w:r>
+        <w:t xml:space="preserve">Measured against the same</w:t>
+      </w:r>
+      <w:r>
+        <w:t xml:space="preserve"> </w:t>
+      </w:r>
+      <w:r>
+        <w:t xml:space="preserve">“Relevance to us”</w:t>
+      </w:r>
+      <w:r>
+        <w:t xml:space="preserve"> </w:t>
+      </w:r>
+      <w:r>
+        <w:t xml:space="preserve">row,</w:t>
+      </w:r>
+      <w:r>
+        <w:t xml:space="preserve"> </w:t>
+      </w:r>
+      <w:r>
+        <w:t xml:space="preserve">they land together at</w:t>
+      </w:r>
+      <w:r>
+        <w:t xml:space="preserve"> </w:t>
+      </w:r>
+      <w:r>
+        <w:t xml:space="preserve">“reference only”</w:t>
+      </w:r>
+      <w:r>
+        <w:t xml:space="preserve">,</w:t>
+      </w:r>
+      <w:r>
+        <w:t xml:space="preserve"> </w:t>
+      </w:r>
+      <w:r>
+        <w:t xml:space="preserve">with LangGraph the one to read first</w:t>
+      </w:r>
+      <w:r>
+        <w:t xml:space="preserve"> </w:t>
+      </w:r>
+      <w:r>
+        <w:t xml:space="preserve">if a durable Python pipeline with human sign-off ever becomes a lab need.</w:t>
+      </w:r>
+    </w:p>
+    <w:bookmarkEnd w:id="66"/>
+    <w:bookmarkStart w:id="67" w:name="sec-orch-recommendation"/>
     <w:p>
       <w:pPr>
         <w:pStyle w:val="Heading1"/>
       </w:pPr>
       <w:r>
-        <w:t xml:space="preserve">7. Recommendation</w:t>
+        <w:t xml:space="preserve">8. Recommendation</w:t>
       </w:r>
     </w:p>
     <w:p>
@@ -2503,15 +5204,14 @@
         <w:pStyle w:val="FirstParagraph"/>
       </w:pPr>
       <w:r>
-        <w:t xml:space="preserve">For the lab, as of August 2026:</w:t>
-      </w:r>
-    </w:p>
-    <w:p>
-      <w:pPr>
-        <w:pStyle w:val="Compact"/>
+        <w:t xml:space="preserve">For the lab, as of September 2026:</w:t>
+      </w:r>
+    </w:p>
+    <w:p>
+      <w:pPr>
         <w:numPr>
           <w:ilvl w:val="0"/>
-          <w:numId w:val="1003"/>
+          <w:numId w:val="1005"/>
         </w:numPr>
       </w:pPr>
       <w:r>
@@ -2548,10 +5248,9 @@
     </w:p>
     <w:p>
       <w:pPr>
-        <w:pStyle w:val="Compact"/>
         <w:numPr>
           <w:ilvl w:val="0"/>
-          <w:numId w:val="1003"/>
+          <w:numId w:val="1005"/>
         </w:numPr>
       </w:pPr>
       <w:r>
@@ -2588,10 +5287,9 @@
     </w:p>
     <w:p>
       <w:pPr>
-        <w:pStyle w:val="Compact"/>
         <w:numPr>
           <w:ilvl w:val="0"/>
-          <w:numId w:val="1003"/>
+          <w:numId w:val="1005"/>
         </w:numPr>
       </w:pPr>
       <w:r>
@@ -2622,6 +5320,50 @@
     </w:p>
     <w:p>
       <w:pPr>
+        <w:numPr>
+          <w:ilvl w:val="0"/>
+          <w:numId w:val="1005"/>
+        </w:numPr>
+      </w:pPr>
+      <w:r>
+        <w:rPr>
+          <w:b/>
+          <w:bCs/>
+        </w:rPr>
+        <w:t xml:space="preserve">Build nothing on the orchestration frameworks</w:t>
+      </w:r>
+      <w:r>
+        <w:t xml:space="preserve"> </w:t>
+      </w:r>
+      <w:r>
+        <w:t xml:space="preserve">in</w:t>
+      </w:r>
+      <w:r>
+        <w:t xml:space="preserve"> </w:t>
+      </w:r>
+      <w:hyperlink w:anchor="sec-orch-frameworks">
+        <w:r>
+          <w:rPr>
+            <w:rStyle w:val="Hyperlink"/>
+          </w:rPr>
+          <w:t xml:space="preserve">Section 6</w:t>
+        </w:r>
+      </w:hyperlink>
+      <w:r>
+        <w:t xml:space="preserve"> </w:t>
+      </w:r>
+      <w:r>
+        <w:t xml:space="preserve">until a concrete need appears that Claude Code cannot meet;</w:t>
+      </w:r>
+      <w:r>
+        <w:t xml:space="preserve"> </w:t>
+      </w:r>
+      <w:r>
+        <w:t xml:space="preserve">read the LangGraph documentation as the reference design if one does.</w:t>
+      </w:r>
+    </w:p>
+    <w:p>
+      <w:pPr>
         <w:pStyle w:val="FirstParagraph"/>
       </w:pPr>
       <w:r>
@@ -2661,8 +5403,8 @@
         <w:t xml:space="preserve">and TORQCLAW is, for now, only a reference.</w:t>
       </w:r>
     </w:p>
-    <w:bookmarkEnd w:id="36"/>
-    <w:bookmarkStart w:id="41" w:name="references"/>
+    <w:bookmarkEnd w:id="67"/>
+    <w:bookmarkStart w:id="91" w:name="references"/>
     <w:p>
       <w:pPr>
         <w:pStyle w:val="Heading1"/>
@@ -2671,8 +5413,8 @@
         <w:t xml:space="preserve">References</w:t>
       </w:r>
     </w:p>
-    <w:bookmarkStart w:id="40" w:name="refs"/>
-    <w:bookmarkStart w:id="37" w:name="ref-claude_agent_teams"/>
+    <w:bookmarkStart w:id="90" w:name="refs"/>
+    <w:bookmarkStart w:id="68" w:name="ref-claude_agent_teams"/>
     <w:p>
       <w:pPr>
         <w:pStyle w:val="Bibliography"/>
@@ -2708,8 +5450,230 @@
         <w:t xml:space="preserve">.</w:t>
       </w:r>
     </w:p>
-    <w:bookmarkEnd w:id="37"/>
-    <w:bookmarkStart w:id="38" w:name="ref-inflexa"/>
+    <w:bookmarkEnd w:id="68"/>
+    <w:bookmarkStart w:id="69" w:name="ref-camel_ai"/>
+    <w:p>
+      <w:pPr>
+        <w:pStyle w:val="Bibliography"/>
+      </w:pPr>
+      <w:r>
+        <w:t xml:space="preserve">CAMEL-AI. 2026.</w:t>
+      </w:r>
+      <w:r>
+        <w:t xml:space="preserve"> </w:t>
+      </w:r>
+      <w:r>
+        <w:rPr>
+          <w:i/>
+          <w:iCs/>
+        </w:rPr>
+        <w:t xml:space="preserve">CAMEL: Finding the Scaling Laws of Agents</w:t>
+      </w:r>
+      <w:r>
+        <w:t xml:space="preserve">. Software.</w:t>
+      </w:r>
+      <w:r>
+        <w:t xml:space="preserve"> </w:t>
+      </w:r>
+      <w:hyperlink r:id="rId63">
+        <w:r>
+          <w:rPr>
+            <w:rStyle w:val="Hyperlink"/>
+          </w:rPr>
+          <w:t xml:space="preserve">https://github.com/camel-ai/camel</w:t>
+        </w:r>
+      </w:hyperlink>
+      <w:r>
+        <w:t xml:space="preserve">.</w:t>
+      </w:r>
+    </w:p>
+    <w:bookmarkEnd w:id="69"/>
+    <w:bookmarkStart w:id="71" w:name="ref-crewai_repo"/>
+    <w:p>
+      <w:pPr>
+        <w:pStyle w:val="Bibliography"/>
+      </w:pPr>
+      <w:r>
+        <w:t xml:space="preserve">CrewAI. 2026a.</w:t>
+      </w:r>
+      <w:r>
+        <w:t xml:space="preserve"> </w:t>
+      </w:r>
+      <w:r>
+        <w:rPr>
+          <w:i/>
+          <w:iCs/>
+        </w:rPr>
+        <w:t xml:space="preserve">CrewAI</w:t>
+      </w:r>
+      <w:r>
+        <w:t xml:space="preserve">. Software.</w:t>
+      </w:r>
+      <w:r>
+        <w:t xml:space="preserve"> </w:t>
+      </w:r>
+      <w:hyperlink r:id="rId70">
+        <w:r>
+          <w:rPr>
+            <w:rStyle w:val="Hyperlink"/>
+          </w:rPr>
+          <w:t xml:space="preserve">https://github.com/crewAIInc/crewAI</w:t>
+        </w:r>
+      </w:hyperlink>
+      <w:r>
+        <w:t xml:space="preserve">.</w:t>
+      </w:r>
+    </w:p>
+    <w:bookmarkEnd w:id="71"/>
+    <w:bookmarkStart w:id="72" w:name="ref-crewai_docs"/>
+    <w:p>
+      <w:pPr>
+        <w:pStyle w:val="Bibliography"/>
+      </w:pPr>
+      <w:r>
+        <w:t xml:space="preserve">CrewAI. 2026b.</w:t>
+      </w:r>
+      <w:r>
+        <w:t xml:space="preserve"> </w:t>
+      </w:r>
+      <w:r>
+        <w:rPr>
+          <w:i/>
+          <w:iCs/>
+        </w:rPr>
+        <w:t xml:space="preserve">CrewAI Introduction</w:t>
+      </w:r>
+      <w:r>
+        <w:t xml:space="preserve">. Documentation.</w:t>
+      </w:r>
+      <w:r>
+        <w:t xml:space="preserve"> </w:t>
+      </w:r>
+      <w:hyperlink r:id="rId47">
+        <w:r>
+          <w:rPr>
+            <w:rStyle w:val="Hyperlink"/>
+          </w:rPr>
+          <w:t xml:space="preserve">https://docs.crewai.com/en/introduction</w:t>
+        </w:r>
+      </w:hyperlink>
+      <w:r>
+        <w:t xml:space="preserve">.</w:t>
+      </w:r>
+    </w:p>
+    <w:bookmarkEnd w:id="72"/>
+    <w:bookmarkStart w:id="73" w:name="ref-metagpt"/>
+    <w:p>
+      <w:pPr>
+        <w:pStyle w:val="Bibliography"/>
+      </w:pPr>
+      <w:r>
+        <w:t xml:space="preserve">FoundationAgents. 2026.</w:t>
+      </w:r>
+      <w:r>
+        <w:t xml:space="preserve"> </w:t>
+      </w:r>
+      <w:r>
+        <w:rPr>
+          <w:i/>
+          <w:iCs/>
+        </w:rPr>
+        <w:t xml:space="preserve">MetaGPT: The Multi-Agent Framework</w:t>
+      </w:r>
+      <w:r>
+        <w:t xml:space="preserve">. Software.</w:t>
+      </w:r>
+      <w:r>
+        <w:t xml:space="preserve"> </w:t>
+      </w:r>
+      <w:hyperlink r:id="rId59">
+        <w:r>
+          <w:rPr>
+            <w:rStyle w:val="Hyperlink"/>
+          </w:rPr>
+          <w:t xml:space="preserve">https://github.com/FoundationAgents/MetaGPT</w:t>
+        </w:r>
+      </w:hyperlink>
+      <w:r>
+        <w:t xml:space="preserve">.</w:t>
+      </w:r>
+    </w:p>
+    <w:bookmarkEnd w:id="73"/>
+    <w:bookmarkStart w:id="74" w:name="ref-google_adk"/>
+    <w:p>
+      <w:pPr>
+        <w:pStyle w:val="Bibliography"/>
+      </w:pPr>
+      <w:r>
+        <w:t xml:space="preserve">Google. 2026.</w:t>
+      </w:r>
+      <w:r>
+        <w:t xml:space="preserve"> </w:t>
+      </w:r>
+      <w:r>
+        <w:rPr>
+          <w:i/>
+          <w:iCs/>
+        </w:rPr>
+        <w:t xml:space="preserve">Agent Development Kit (ADK) for Python</w:t>
+      </w:r>
+      <w:r>
+        <w:t xml:space="preserve">. Software.</w:t>
+      </w:r>
+      <w:r>
+        <w:t xml:space="preserve"> </w:t>
+      </w:r>
+      <w:hyperlink r:id="rId55">
+        <w:r>
+          <w:rPr>
+            <w:rStyle w:val="Hyperlink"/>
+          </w:rPr>
+          <w:t xml:space="preserve">https://github.com/google/adk-python</w:t>
+        </w:r>
+      </w:hyperlink>
+      <w:r>
+        <w:t xml:space="preserve">.</w:t>
+      </w:r>
+    </w:p>
+    <w:bookmarkEnd w:id="74"/>
+    <w:bookmarkStart w:id="75" w:name="ref-smolagents"/>
+    <w:p>
+      <w:pPr>
+        <w:pStyle w:val="Bibliography"/>
+      </w:pPr>
+      <w:r>
+        <w:t xml:space="preserve">Hugging Face. 2026.</w:t>
+      </w:r>
+      <w:r>
+        <w:t xml:space="preserve"> </w:t>
+      </w:r>
+      <w:r>
+        <w:rPr>
+          <w:i/>
+          <w:iCs/>
+        </w:rPr>
+        <w:t xml:space="preserve">Smolagents</w:t>
+      </w:r>
+      <w:r>
+        <w:t xml:space="preserve">. Software.</w:t>
+      </w:r>
+      <w:r>
+        <w:t xml:space="preserve"> </w:t>
+      </w:r>
+      <w:hyperlink r:id="rId61">
+        <w:r>
+          <w:rPr>
+            <w:rStyle w:val="Hyperlink"/>
+          </w:rPr>
+          <w:t xml:space="preserve">https://github.com/huggingface/smolagents</w:t>
+        </w:r>
+      </w:hyperlink>
+      <w:r>
+        <w:t xml:space="preserve">.</w:t>
+      </w:r>
+    </w:p>
+    <w:bookmarkEnd w:id="75"/>
+    <w:bookmarkStart w:id="76" w:name="ref-inflexa"/>
     <w:p>
       <w:pPr>
         <w:pStyle w:val="Bibliography"/>
@@ -2745,8 +5709,304 @@
         <w:t xml:space="preserve">.</w:t>
       </w:r>
     </w:p>
-    <w:bookmarkEnd w:id="38"/>
-    <w:bookmarkStart w:id="39" w:name="ref-torqclaw"/>
+    <w:bookmarkEnd w:id="76"/>
+    <w:bookmarkStart w:id="78" w:name="ref-langgraph_repo"/>
+    <w:p>
+      <w:pPr>
+        <w:pStyle w:val="Bibliography"/>
+      </w:pPr>
+      <w:r>
+        <w:t xml:space="preserve">LangChain. 2026a.</w:t>
+      </w:r>
+      <w:r>
+        <w:t xml:space="preserve"> </w:t>
+      </w:r>
+      <w:r>
+        <w:rPr>
+          <w:i/>
+          <w:iCs/>
+        </w:rPr>
+        <w:t xml:space="preserve">LangGraph</w:t>
+      </w:r>
+      <w:r>
+        <w:t xml:space="preserve">. Software.</w:t>
+      </w:r>
+      <w:r>
+        <w:t xml:space="preserve"> </w:t>
+      </w:r>
+      <w:hyperlink r:id="rId77">
+        <w:r>
+          <w:rPr>
+            <w:rStyle w:val="Hyperlink"/>
+          </w:rPr>
+          <w:t xml:space="preserve">https://github.com/langchain-ai/langgraph</w:t>
+        </w:r>
+      </w:hyperlink>
+      <w:r>
+        <w:t xml:space="preserve">.</w:t>
+      </w:r>
+    </w:p>
+    <w:bookmarkEnd w:id="78"/>
+    <w:bookmarkStart w:id="79" w:name="ref-langgraph_docs"/>
+    <w:p>
+      <w:pPr>
+        <w:pStyle w:val="Bibliography"/>
+      </w:pPr>
+      <w:r>
+        <w:t xml:space="preserve">LangChain. 2026b.</w:t>
+      </w:r>
+      <w:r>
+        <w:t xml:space="preserve"> </w:t>
+      </w:r>
+      <w:r>
+        <w:rPr>
+          <w:i/>
+          <w:iCs/>
+        </w:rPr>
+        <w:t xml:space="preserve">LangGraph Overview</w:t>
+      </w:r>
+      <w:r>
+        <w:t xml:space="preserve">. Documentation.</w:t>
+      </w:r>
+      <w:r>
+        <w:t xml:space="preserve"> </w:t>
+      </w:r>
+      <w:hyperlink r:id="rId43">
+        <w:r>
+          <w:rPr>
+            <w:rStyle w:val="Hyperlink"/>
+          </w:rPr>
+          <w:t xml:space="preserve">https://docs.langchain.com/oss/python/langgraph/overview</w:t>
+        </w:r>
+      </w:hyperlink>
+      <w:r>
+        <w:t xml:space="preserve">.</w:t>
+      </w:r>
+    </w:p>
+    <w:bookmarkEnd w:id="79"/>
+    <w:bookmarkStart w:id="80" w:name="ref-llama_index"/>
+    <w:p>
+      <w:pPr>
+        <w:pStyle w:val="Bibliography"/>
+      </w:pPr>
+      <w:r>
+        <w:t xml:space="preserve">LlamaIndex. 2026.</w:t>
+      </w:r>
+      <w:r>
+        <w:t xml:space="preserve"> </w:t>
+      </w:r>
+      <w:r>
+        <w:rPr>
+          <w:i/>
+          <w:iCs/>
+        </w:rPr>
+        <w:t xml:space="preserve">LlamaIndex</w:t>
+      </w:r>
+      <w:r>
+        <w:t xml:space="preserve">. Software.</w:t>
+      </w:r>
+      <w:r>
+        <w:t xml:space="preserve"> </w:t>
+      </w:r>
+      <w:hyperlink r:id="rId60">
+        <w:r>
+          <w:rPr>
+            <w:rStyle w:val="Hyperlink"/>
+          </w:rPr>
+          <w:t xml:space="preserve">https://github.com/run-llama/llama_index</w:t>
+        </w:r>
+      </w:hyperlink>
+      <w:r>
+        <w:t xml:space="preserve">.</w:t>
+      </w:r>
+    </w:p>
+    <w:bookmarkEnd w:id="80"/>
+    <w:bookmarkStart w:id="82" w:name="ref-autogen_teams"/>
+    <w:p>
+      <w:pPr>
+        <w:pStyle w:val="Bibliography"/>
+      </w:pPr>
+      <w:r>
+        <w:t xml:space="preserve">Microsoft. 2026a.</w:t>
+      </w:r>
+      <w:r>
+        <w:t xml:space="preserve"> </w:t>
+      </w:r>
+      <w:r>
+        <w:rPr>
+          <w:i/>
+          <w:iCs/>
+        </w:rPr>
+        <w:t xml:space="preserve">AutoGen AgentChat Tutorial: Teams</w:t>
+      </w:r>
+      <w:r>
+        <w:t xml:space="preserve">. Documentation.</w:t>
+      </w:r>
+      <w:r>
+        <w:t xml:space="preserve"> </w:t>
+      </w:r>
+      <w:hyperlink r:id="rId81">
+        <w:r>
+          <w:rPr>
+            <w:rStyle w:val="Hyperlink"/>
+          </w:rPr>
+          <w:t xml:space="preserve">https://microsoft.github.io/autogen/stable/user-guide/agentchat-user-guide/tutorial/teams.html</w:t>
+        </w:r>
+      </w:hyperlink>
+      <w:r>
+        <w:t xml:space="preserve">.</w:t>
+      </w:r>
+    </w:p>
+    <w:bookmarkEnd w:id="82"/>
+    <w:bookmarkStart w:id="83" w:name="ref-autogen_docs"/>
+    <w:p>
+      <w:pPr>
+        <w:pStyle w:val="Bibliography"/>
+      </w:pPr>
+      <w:r>
+        <w:t xml:space="preserve">Microsoft. 2026b.</w:t>
+      </w:r>
+      <w:r>
+        <w:t xml:space="preserve"> </w:t>
+      </w:r>
+      <w:r>
+        <w:rPr>
+          <w:i/>
+          <w:iCs/>
+        </w:rPr>
+        <w:t xml:space="preserve">AutoGen Documentation</w:t>
+      </w:r>
+      <w:r>
+        <w:t xml:space="preserve">. Documentation.</w:t>
+      </w:r>
+      <w:r>
+        <w:t xml:space="preserve"> </w:t>
+      </w:r>
+      <w:hyperlink r:id="rId35">
+        <w:r>
+          <w:rPr>
+            <w:rStyle w:val="Hyperlink"/>
+          </w:rPr>
+          <w:t xml:space="preserve">https://microsoft.github.io/autogen/stable/</w:t>
+        </w:r>
+      </w:hyperlink>
+      <w:r>
+        <w:t xml:space="preserve">.</w:t>
+      </w:r>
+    </w:p>
+    <w:bookmarkEnd w:id="83"/>
+    <w:bookmarkStart w:id="85" w:name="ref-autogen_repo"/>
+    <w:p>
+      <w:pPr>
+        <w:pStyle w:val="Bibliography"/>
+      </w:pPr>
+      <w:r>
+        <w:t xml:space="preserve">Microsoft. 2026c.</w:t>
+      </w:r>
+      <w:r>
+        <w:t xml:space="preserve"> </w:t>
+      </w:r>
+      <w:r>
+        <w:rPr>
+          <w:i/>
+          <w:iCs/>
+        </w:rPr>
+        <w:t xml:space="preserve">AutoGen: A Framework for Building AI Agents and Applications</w:t>
+      </w:r>
+      <w:r>
+        <w:t xml:space="preserve">. Software.</w:t>
+      </w:r>
+      <w:r>
+        <w:t xml:space="preserve"> </w:t>
+      </w:r>
+      <w:hyperlink r:id="rId84">
+        <w:r>
+          <w:rPr>
+            <w:rStyle w:val="Hyperlink"/>
+          </w:rPr>
+          <w:t xml:space="preserve">https://github.com/microsoft/autogen</w:t>
+        </w:r>
+      </w:hyperlink>
+      <w:r>
+        <w:t xml:space="preserve">.</w:t>
+      </w:r>
+    </w:p>
+    <w:bookmarkEnd w:id="85"/>
+    <w:bookmarkStart w:id="86" w:name="ref-microsoft_agent_framework"/>
+    <w:p>
+      <w:pPr>
+        <w:pStyle w:val="Bibliography"/>
+      </w:pPr>
+      <w:r>
+        <w:t xml:space="preserve">Microsoft. 2026d.</w:t>
+      </w:r>
+      <w:r>
+        <w:t xml:space="preserve"> </w:t>
+      </w:r>
+      <w:r>
+        <w:rPr>
+          <w:i/>
+          <w:iCs/>
+        </w:rPr>
+        <w:t xml:space="preserve">Microsoft Agent Framework</w:t>
+      </w:r>
+      <w:r>
+        <w:t xml:space="preserve">. Software.</w:t>
+      </w:r>
+      <w:r>
+        <w:t xml:space="preserve"> </w:t>
+      </w:r>
+      <w:hyperlink r:id="rId39">
+        <w:r>
+          <w:rPr>
+            <w:rStyle w:val="Hyperlink"/>
+          </w:rPr>
+          <w:t xml:space="preserve">https://github.com/microsoft/agent-framework</w:t>
+        </w:r>
+      </w:hyperlink>
+      <w:r>
+        <w:t xml:space="preserve">.</w:t>
+      </w:r>
+    </w:p>
+    <w:bookmarkEnd w:id="86"/>
+    <w:bookmarkStart w:id="87" w:name="ref-openai_agents_sdk"/>
+    <w:p>
+      <w:pPr>
+        <w:pStyle w:val="Bibliography"/>
+      </w:pPr>
+      <w:r>
+        <w:t xml:space="preserve">OpenAI. 2026.</w:t>
+      </w:r>
+      <w:r>
+        <w:t xml:space="preserve"> </w:t>
+      </w:r>
+      <w:r>
+        <w:rPr>
+          <w:i/>
+          <w:iCs/>
+        </w:rPr>
+        <w:t xml:space="preserve">OpenAI Agents SDK</w:t>
+      </w:r>
+      <w:r>
+        <w:t xml:space="preserve">. Software.</w:t>
+      </w:r>
+      <w:r>
+        <w:t xml:space="preserve"> </w:t>
+      </w:r>
+      <w:hyperlink r:id="rId51">
+        <w:r>
+          <w:rPr>
+            <w:rStyle w:val="Hyperlink"/>
+          </w:rPr>
+          <w:t xml:space="preserve">https://github.com/openai/openai-agents-python</w:t>
+        </w:r>
+      </w:hyperlink>
+      <w:r>
+        <w:t xml:space="preserve">.</w:t>
+      </w:r>
+    </w:p>
+    <w:bookmarkEnd w:id="87"/>
+    <w:bookmarkStart w:id="88" w:name="ref-torqclaw"/>
     <w:p>
       <w:pPr>
         <w:pStyle w:val="Bibliography"/>
@@ -2785,9 +6045,46 @@
         <w:t xml:space="preserve">.</w:t>
       </w:r>
     </w:p>
-    <w:bookmarkEnd w:id="39"/>
-    <w:bookmarkEnd w:id="40"/>
-    <w:bookmarkEnd w:id="41"/>
+    <w:bookmarkEnd w:id="88"/>
+    <w:bookmarkStart w:id="89" w:name="ref-pydantic_ai"/>
+    <w:p>
+      <w:pPr>
+        <w:pStyle w:val="Bibliography"/>
+      </w:pPr>
+      <w:r>
+        <w:t xml:space="preserve">Pydantic. 2026.</w:t>
+      </w:r>
+      <w:r>
+        <w:t xml:space="preserve"> </w:t>
+      </w:r>
+      <w:r>
+        <w:rPr>
+          <w:i/>
+          <w:iCs/>
+        </w:rPr>
+        <w:t xml:space="preserve">Pydantic AI</w:t>
+      </w:r>
+      <w:r>
+        <w:t xml:space="preserve">. Software.</w:t>
+      </w:r>
+      <w:r>
+        <w:t xml:space="preserve"> </w:t>
+      </w:r>
+      <w:hyperlink r:id="rId62">
+        <w:r>
+          <w:rPr>
+            <w:rStyle w:val="Hyperlink"/>
+          </w:rPr>
+          <w:t xml:space="preserve">https://github.com/pydantic/pydantic-ai</w:t>
+        </w:r>
+      </w:hyperlink>
+      <w:r>
+        <w:t xml:space="preserve">.</w:t>
+      </w:r>
+    </w:p>
+    <w:bookmarkEnd w:id="89"/>
+    <w:bookmarkEnd w:id="90"/>
+    <w:bookmarkEnd w:id="91"/>
     <w:sectPr>
       <w:footnotePr>
         <w:numRestart w:val="eachSect"/>
@@ -3011,6 +6308,12 @@
     <w:abstractNumId w:val="991"/>
   </w:num>
   <w:num w:numId="1003">
+    <w:abstractNumId w:val="991"/>
+  </w:num>
+  <w:num w:numId="1004">
+    <w:abstractNumId w:val="991"/>
+  </w:num>
+  <w:num w:numId="1005">
     <w:abstractNumId w:val="991"/>
   </w:num>
 </w:numbering>

</xml_diff>